<commit_message>
docs: update RIGGING_SPEC to v2 — full 3D, 12 targets, full Korean coverage
스코프 변경 반영: 인터랙티브 3D 애니메이션 필요.
- 사지털 단면 → 풀 3D 모델 요구 변경
- tongue_lateral_channel 타깃 추가 (혀 양옆 상승·중앙 함몰, 설측음 /ㄹ/)
  총 11 → 12개 블렌드셰이프
- 한국어 자음 19개·단모음 10개·이중모음 11개 전체 매핑 추가
  (평음/격음/경음은 동일 타깃 + 기류 차이로 처리, 이중모음은 보간 처리)
- 공기 흐름 출구 마커 섹션 추가 (oral_central/left/right, labial, nasal_l/r)
- tongue_lateral_channel 관상면(coronal) 다이어그램 추가
- RIGGING_TARGETS.pdf v2로 재생성 (12 타깃)
</commit_message>
<xml_diff>
--- a/docs/RIGGING_SPEC.docx
+++ b/docs/RIGGING_SPEC.docx
@@ -7,17 +7,17 @@
         <w:pStyle w:val="Title"/>
       </w:pPr>
       <w:r>
-        <w:t>조음기관 3D 리깅 사양서 (Articulator Rig Spec)</w:t>
+        <w:t>조음기관 3D 리깅 사양서 v2 (Articulator Rig Spec v2)</w:t>
       </w:r>
     </w:p>
     <w:p>
       <w:r>
-        <w:t>대림대학교 Voice Lab · 조음기관 시각화 모듈용</w:t>
+        <w:t>대림대학교 Voice Lab · 조음기관 인터랙티브 3D 애니메이션 모듈용</w:t>
       </w:r>
     </w:p>
     <w:p>
       <w:r>
-        <w:t>목적: 정중시상(midsagittal) 두부 모델의 조음기관(혀·연구개·턱·입술)을 음소 단위로 정확히 움직일 수 있도록 리깅한다. 결과물은 웹(three.js)에서 본 회전 / 블렌드셰이프 가중치로 실시간 제어된다.</w:t>
+        <w:t>목적: 한국어 모든 자음(19개) · 단모음(10개) · 이중모음(11개)을 시각적으로 실현할 수 있도록 두부 3D 모델을 리깅한다. 결과물은 웹(three.js)에서 블렌드셰이프 가중치 + 공기 흐름(particle) 시각화로 실시간 제어된다.</w:t>
       </w:r>
     </w:p>
     <w:p>
@@ -33,7 +33,7 @@
         <w:pStyle w:val="ListBullet"/>
       </w:pPr>
       <w:r>
-        <w:t>*.glb (glTF 2.0 binary) — 최종 포맷. (FBX/Blender로 작업하더라도 export는 glb)</w:t>
+        <w:t>*.glb (glTF 2.0 binary) — 최종 포맷.</w:t>
       </w:r>
     </w:p>
     <w:p>
@@ -49,7 +49,7 @@
         <w:pStyle w:val="ListBullet"/>
       </w:pPr>
       <w:r>
-        <w:t>리깅 전 중립(rest) 포즈 1개 + 아래 정의된 가동 타깃 일체.</w:t>
+        <w:t>*.mb (Maya 원본) — 수정 대비 동봉.</w:t>
       </w:r>
     </w:p>
     <w:p>
@@ -57,7 +57,23 @@
         <w:pStyle w:val="ListBullet"/>
       </w:pPr>
       <w:r>
-        <w:t>(선택) 음소별 애니메이션 클립. 없으면 코드에서 타깃을 조합해 생성한다.</w:t>
+        <w:t>중립 포즈 + 12개 블렌드셰이프 타깃.</w:t>
+      </w:r>
+    </w:p>
+    <w:p>
+      <w:pPr>
+        <w:pStyle w:val="ListBullet"/>
+      </w:pPr>
+      <w:r>
+        <w:t>(선택) 공기 흐름 출구 마커(빈 노드) — 좌표만 텍스트로 전달해도 무방.</w:t>
+      </w:r>
+    </w:p>
+    <w:p>
+      <w:pPr>
+        <w:pStyle w:val="ListBullet"/>
+      </w:pPr>
+      <w:r>
+        <w:t>검수용 영상: 각 타깃 0→1 변형 시연 (타깃당 2~3초).</w:t>
       </w:r>
     </w:p>
     <w:p>
@@ -65,7 +81,12 @@
         <w:pStyle w:val="Heading1"/>
       </w:pPr>
       <w:r>
-        <w:t>2. 좌표 / 방향 규약</w:t>
+        <w:t>2. 모델 구조 — 풀 3D 필수</w:t>
+      </w:r>
+    </w:p>
+    <w:p>
+      <w:r>
+        <w:t>중요: 사지털 단면이 아니라 풀 3D(360°)로 만들어 주세요. 사용자가 마우스로 회전해 측면·정면·위·아래 모두 볼 수 있어야 합니다. 이유:</w:t>
       </w:r>
     </w:p>
     <w:p>
@@ -73,7 +94,7 @@
         <w:pStyle w:val="ListBullet"/>
       </w:pPr>
       <w:r>
-        <w:t>Y+ = 위(superior), Z+ = 정면(앞, anterior, 코·입술 방향) 권장. 다르면 정면 축을 반드시 명시.</w:t>
+        <w:t>마찰음 ㅅ ㅆ, 파찰음 ㅈ ㅊ ㅉ: 혀 표면 중앙의 세로 홈(median sulcus)이 위·정면 시점에서 보여야 학습자가 이해 가능.</w:t>
       </w:r>
     </w:p>
     <w:p>
@@ -81,7 +102,39 @@
         <w:pStyle w:val="ListBullet"/>
       </w:pPr>
       <w:r>
-        <w:t>원점은 구강 중앙 부근 권장(엄격하지 않음). 스케일·정면축만 명확하면 됨.</w:t>
+        <w:t>설측음 ㄹ: 혀 양옆 측면 통로가 정면 시점에서 보여야 함.</w:t>
+      </w:r>
+    </w:p>
+    <w:p>
+      <w:pPr>
+        <w:pStyle w:val="ListBullet"/>
+      </w:pPr>
+      <w:r>
+        <w:t>공기 흐름: 중앙(구강)/양옆(설측)/비강/입술 출구를 시각적으로 보여줘야 함.</w:t>
+      </w:r>
+    </w:p>
+    <w:p>
+      <w:pPr>
+        <w:pStyle w:val="Heading2"/>
+      </w:pPr>
+      <w:r>
+        <w:t>2.1 좌표 / 방향 규약</w:t>
+      </w:r>
+    </w:p>
+    <w:p>
+      <w:pPr>
+        <w:pStyle w:val="ListBullet"/>
+      </w:pPr>
+      <w:r>
+        <w:t>Y+ = 위(superior), +Z 또는 +X = 정면(anterior) — 작업 후 명시.</w:t>
+      </w:r>
+    </w:p>
+    <w:p>
+      <w:pPr>
+        <w:pStyle w:val="ListBullet"/>
+      </w:pPr>
+      <w:r>
+        <w:t>원점은 구강 중앙 부근 권장.</w:t>
       </w:r>
     </w:p>
     <w:p>
@@ -97,7 +150,7 @@
         <w:pStyle w:val="ListBullet"/>
       </w:pPr>
       <w:r>
-        <w:t>토폴로지: 모든 블렌드셰이프는 동일 정점 순서(베이스와 동일 토폴로지)를 공유.</w:t>
+        <w:t>토폴로지: 모든 블렌드셰이프는 동일 정점 순서(베이스와 동일 토폴로지) 공유.</w:t>
       </w:r>
     </w:p>
     <w:p>
@@ -168,7 +221,7 @@
           </w:tcPr>
           <w:p>
             <w:r>
-              <w:t>본(skin)</w:t>
+              <w:t>블렌드셰이프</w:t>
             </w:r>
           </w:p>
         </w:tc>
@@ -178,7 +231,7 @@
           </w:tcPr>
           <w:p>
             <w:r>
-              <w:t>TMJ(귀 앞)에 회전 피벗 1개</w:t>
+              <w:t>jaw_open 하나로 회전 개구 표현</w:t>
             </w:r>
           </w:p>
         </w:tc>
@@ -200,7 +253,7 @@
           </w:tcPr>
           <w:p>
             <w:r>
-              <w:t>본 또는 블렌드셰이프</w:t>
+              <w:t>블렌드셰이프</w:t>
             </w:r>
           </w:p>
         </w:tc>
@@ -210,7 +263,7 @@
           </w:tcPr>
           <w:p>
             <w:r>
-              <w:t>폐쇄/원순/펼침</w:t>
+              <w:t>폐쇄/원순/펼침 3종</w:t>
             </w:r>
           </w:p>
         </w:tc>
@@ -232,7 +285,7 @@
           </w:tcPr>
           <w:p>
             <w:r>
-              <w:t>블렌드셰이프(모프 타깃) 강력 권장</w:t>
+              <w:t>블렌드셰이프</w:t>
             </w:r>
           </w:p>
         </w:tc>
@@ -242,7 +295,7 @@
           </w:tcPr>
           <w:p>
             <w:r>
-              <w:t>끝말림·홈·전후 미세 변형은 본보다 모프가 깔끔</w:t>
+              <w:t>끝·앞·뒤·후방·홈·측면채널 등 7종</w:t>
             </w:r>
           </w:p>
         </w:tc>
@@ -264,7 +317,7 @@
           </w:tcPr>
           <w:p>
             <w:r>
-              <w:t>블렌드셰이프 또는 본 1개</w:t>
+              <w:t>블렌드셰이프</w:t>
             </w:r>
           </w:p>
         </w:tc>
@@ -282,7 +335,7 @@
     </w:tbl>
     <w:p>
       <w:r>
-        <w:t>혼합 가능: 턱·입술=본, 혀·연구개=블렌드셰이프. 전부 블렌드셰이프여도 무방.</w:t>
+        <w:t>전체를 블렌드셰이프로 통일.</w:t>
       </w:r>
     </w:p>
     <w:p>
@@ -290,12 +343,12 @@
         <w:pStyle w:val="Heading1"/>
       </w:pPr>
       <w:r>
-        <w:t>4. 필수 가동 타깃 (정확히 이 이름으로)</w:t>
+        <w:t>4. 블렌드셰이프 타깃 — 총 12개</w:t>
       </w:r>
     </w:p>
     <w:p>
       <w:r>
-        <w:t>블렌드셰이프는 0=중립, 1=완전 변형으로 정규화. 본은 회전축/한계각을 문서화.</w:t>
+        <w:t>블렌드셰이프는 0=중립, 1=완전 변형으로 정규화. 모든 타깃은 상호 가산(addition) 가능해야 함 (예: lips_closed + velum_open 동시 적용 = ㅁ).</w:t>
       </w:r>
     </w:p>
     <w:p>
@@ -303,7 +356,7 @@
         <w:pStyle w:val="Heading2"/>
       </w:pPr>
       <w:r>
-        <w:t>혀 (Tongue) — 블렌드셰이프 권장</w:t>
+        <w:t>혀 (Tongue) — 7개</w:t>
       </w:r>
     </w:p>
     <w:tbl>
@@ -313,13 +366,25 @@
         <w:tblLook w:firstColumn="1" w:firstRow="1" w:lastColumn="0" w:lastRow="0" w:noHBand="0" w:noVBand="1" w:val="04A0"/>
       </w:tblPr>
       <w:tblGrid>
-        <w:gridCol w:w="4320"/>
-        <w:gridCol w:w="4320"/>
+        <w:gridCol w:w="2160"/>
+        <w:gridCol w:w="2160"/>
+        <w:gridCol w:w="2160"/>
+        <w:gridCol w:w="2160"/>
       </w:tblGrid>
       <w:tr>
         <w:tc>
           <w:tcPr>
-            <w:tcW w:type="dxa" w:w="4320"/>
+            <w:tcW w:type="dxa" w:w="2160"/>
+          </w:tcPr>
+          <w:p>
+            <w:r>
+              <w:t>#</w:t>
+            </w:r>
+          </w:p>
+        </w:tc>
+        <w:tc>
+          <w:tcPr>
+            <w:tcW w:type="dxa" w:w="2160"/>
           </w:tcPr>
           <w:p>
             <w:r>
@@ -329,7 +394,7 @@
         </w:tc>
         <w:tc>
           <w:tcPr>
-            <w:tcW w:type="dxa" w:w="4320"/>
+            <w:tcW w:type="dxa" w:w="2160"/>
           </w:tcPr>
           <w:p>
             <w:r>
@@ -337,11 +402,31 @@
             </w:r>
           </w:p>
         </w:tc>
+        <w:tc>
+          <w:tcPr>
+            <w:tcW w:type="dxa" w:w="2160"/>
+          </w:tcPr>
+          <w:p>
+            <w:r>
+              <w:t>활용 예</w:t>
+            </w:r>
+          </w:p>
+        </w:tc>
       </w:tr>
       <w:tr>
         <w:tc>
           <w:tcPr>
-            <w:tcW w:type="dxa" w:w="4320"/>
+            <w:tcW w:type="dxa" w:w="2160"/>
+          </w:tcPr>
+          <w:p>
+            <w:r>
+              <w:t>1</w:t>
+            </w:r>
+          </w:p>
+        </w:tc>
+        <w:tc>
+          <w:tcPr>
+            <w:tcW w:type="dxa" w:w="2160"/>
           </w:tcPr>
           <w:p>
             <w:r>
@@ -351,11 +436,21 @@
         </w:tc>
         <w:tc>
           <w:tcPr>
-            <w:tcW w:type="dxa" w:w="4320"/>
+            <w:tcW w:type="dxa" w:w="2160"/>
           </w:tcPr>
           <w:p>
             <w:r>
-              <w:t>혀끝이 치경융기(윗니 뒤)에 닿도록 상승</w:t>
+              <w:t>혀끝이 치경융기로 상승</w:t>
+            </w:r>
+          </w:p>
+        </w:tc>
+        <w:tc>
+          <w:tcPr>
+            <w:tcW w:type="dxa" w:w="2160"/>
+          </w:tcPr>
+          <w:p>
+            <w:r>
+              <w:t>ㄷ ㅌ ㄸ ㄴ ㄹ</w:t>
             </w:r>
           </w:p>
         </w:tc>
@@ -363,7 +458,17 @@
       <w:tr>
         <w:tc>
           <w:tcPr>
-            <w:tcW w:type="dxa" w:w="4320"/>
+            <w:tcW w:type="dxa" w:w="2160"/>
+          </w:tcPr>
+          <w:p>
+            <w:r>
+              <w:t>2</w:t>
+            </w:r>
+          </w:p>
+        </w:tc>
+        <w:tc>
+          <w:tcPr>
+            <w:tcW w:type="dxa" w:w="2160"/>
           </w:tcPr>
           <w:p>
             <w:r>
@@ -373,7 +478,7 @@
         </w:tc>
         <w:tc>
           <w:tcPr>
-            <w:tcW w:type="dxa" w:w="4320"/>
+            <w:tcW w:type="dxa" w:w="2160"/>
           </w:tcPr>
           <w:p>
             <w:r>
@@ -381,11 +486,31 @@
             </w:r>
           </w:p>
         </w:tc>
+        <w:tc>
+          <w:tcPr>
+            <w:tcW w:type="dxa" w:w="2160"/>
+          </w:tcPr>
+          <w:p>
+            <w:r>
+              <w:t>보조용</w:t>
+            </w:r>
+          </w:p>
+        </w:tc>
       </w:tr>
       <w:tr>
         <w:tc>
           <w:tcPr>
-            <w:tcW w:type="dxa" w:w="4320"/>
+            <w:tcW w:type="dxa" w:w="2160"/>
+          </w:tcPr>
+          <w:p>
+            <w:r>
+              <w:t>3</w:t>
+            </w:r>
+          </w:p>
+        </w:tc>
+        <w:tc>
+          <w:tcPr>
+            <w:tcW w:type="dxa" w:w="2160"/>
           </w:tcPr>
           <w:p>
             <w:r>
@@ -395,11 +520,21 @@
         </w:tc>
         <w:tc>
           <w:tcPr>
-            <w:tcW w:type="dxa" w:w="4320"/>
+            <w:tcW w:type="dxa" w:w="2160"/>
           </w:tcPr>
           <w:p>
             <w:r>
-              <w:t>혀 앞날(blade)이 경구개로 상승</w:t>
+              <w:t>혀 앞날이 경구개로 상승</w:t>
+            </w:r>
+          </w:p>
+        </w:tc>
+        <w:tc>
+          <w:tcPr>
+            <w:tcW w:type="dxa" w:w="2160"/>
+          </w:tcPr>
+          <w:p>
+            <w:r>
+              <w:t>ㅈ ㅊ ㅉ, 모음 ㅣ ㅔ ㅐ</w:t>
             </w:r>
           </w:p>
         </w:tc>
@@ -407,7 +542,17 @@
       <w:tr>
         <w:tc>
           <w:tcPr>
-            <w:tcW w:type="dxa" w:w="4320"/>
+            <w:tcW w:type="dxa" w:w="2160"/>
+          </w:tcPr>
+          <w:p>
+            <w:r>
+              <w:t>4</w:t>
+            </w:r>
+          </w:p>
+        </w:tc>
+        <w:tc>
+          <w:tcPr>
+            <w:tcW w:type="dxa" w:w="2160"/>
           </w:tcPr>
           <w:p>
             <w:r>
@@ -417,11 +562,21 @@
         </w:tc>
         <w:tc>
           <w:tcPr>
-            <w:tcW w:type="dxa" w:w="4320"/>
+            <w:tcW w:type="dxa" w:w="2160"/>
           </w:tcPr>
           <w:p>
             <w:r>
-              <w:t>혀 뒤(dorsum)가 연구개로 상승·접촉</w:t>
+              <w:t>혀뒤가 연구개로 상승·접촉</w:t>
+            </w:r>
+          </w:p>
+        </w:tc>
+        <w:tc>
+          <w:tcPr>
+            <w:tcW w:type="dxa" w:w="2160"/>
+          </w:tcPr>
+          <w:p>
+            <w:r>
+              <w:t>ㄱ ㅋ ㄲ ㅇ(받침), 모음 ㅜ ㅡ ㅗ</w:t>
             </w:r>
           </w:p>
         </w:tc>
@@ -429,7 +584,17 @@
       <w:tr>
         <w:tc>
           <w:tcPr>
-            <w:tcW w:type="dxa" w:w="4320"/>
+            <w:tcW w:type="dxa" w:w="2160"/>
+          </w:tcPr>
+          <w:p>
+            <w:r>
+              <w:t>5</w:t>
+            </w:r>
+          </w:p>
+        </w:tc>
+        <w:tc>
+          <w:tcPr>
+            <w:tcW w:type="dxa" w:w="2160"/>
           </w:tcPr>
           <w:p>
             <w:r>
@@ -439,7 +604,7 @@
         </w:tc>
         <w:tc>
           <w:tcPr>
-            <w:tcW w:type="dxa" w:w="4320"/>
+            <w:tcW w:type="dxa" w:w="2160"/>
           </w:tcPr>
           <w:p>
             <w:r>
@@ -447,11 +612,31 @@
             </w:r>
           </w:p>
         </w:tc>
+        <w:tc>
+          <w:tcPr>
+            <w:tcW w:type="dxa" w:w="2160"/>
+          </w:tcPr>
+          <w:p>
+            <w:r>
+              <w:t>후설 저모음 ㅏ</w:t>
+            </w:r>
+          </w:p>
+        </w:tc>
       </w:tr>
       <w:tr>
         <w:tc>
           <w:tcPr>
-            <w:tcW w:type="dxa" w:w="4320"/>
+            <w:tcW w:type="dxa" w:w="2160"/>
+          </w:tcPr>
+          <w:p>
+            <w:r>
+              <w:t>6</w:t>
+            </w:r>
+          </w:p>
+        </w:tc>
+        <w:tc>
+          <w:tcPr>
+            <w:tcW w:type="dxa" w:w="2160"/>
           </w:tcPr>
           <w:p>
             <w:r>
@@ -461,11 +646,63 @@
         </w:tc>
         <w:tc>
           <w:tcPr>
-            <w:tcW w:type="dxa" w:w="4320"/>
+            <w:tcW w:type="dxa" w:w="2160"/>
           </w:tcPr>
           <w:p>
             <w:r>
-              <w:t>혀 중앙 세로 홈 형성(마찰음 /s/ 등)</w:t>
+              <w:t>혀 표면 정중앙 세로 홈 (위·정면에서 보임)</w:t>
+            </w:r>
+          </w:p>
+        </w:tc>
+        <w:tc>
+          <w:tcPr>
+            <w:tcW w:type="dxa" w:w="2160"/>
+          </w:tcPr>
+          <w:p>
+            <w:r>
+              <w:t>ㅅ ㅆ, ㅈ ㅊ ㅉ</w:t>
+            </w:r>
+          </w:p>
+        </w:tc>
+      </w:tr>
+      <w:tr>
+        <w:tc>
+          <w:tcPr>
+            <w:tcW w:type="dxa" w:w="2160"/>
+          </w:tcPr>
+          <w:p>
+            <w:r>
+              <w:t>7</w:t>
+            </w:r>
+          </w:p>
+        </w:tc>
+        <w:tc>
+          <w:tcPr>
+            <w:tcW w:type="dxa" w:w="2160"/>
+          </w:tcPr>
+          <w:p>
+            <w:r>
+              <w:t>tongue_lateral_channel</w:t>
+            </w:r>
+          </w:p>
+        </w:tc>
+        <w:tc>
+          <w:tcPr>
+            <w:tcW w:type="dxa" w:w="2160"/>
+          </w:tcPr>
+          <w:p>
+            <w:r>
+              <w:t>혀 양옆 상승해 윗어금니 접촉, 중앙은 낮아져 좌우 공기 통로 (정면에서 보임)</w:t>
+            </w:r>
+          </w:p>
+        </w:tc>
+        <w:tc>
+          <w:tcPr>
+            <w:tcW w:type="dxa" w:w="2160"/>
+          </w:tcPr>
+          <w:p>
+            <w:r>
+              <w:t>ㄹ (설측)</w:t>
             </w:r>
           </w:p>
         </w:tc>
@@ -476,258 +713,7 @@
         <w:pStyle w:val="Heading2"/>
       </w:pPr>
       <w:r>
-        <w:t>연구개 (Velum)</w:t>
-      </w:r>
-    </w:p>
-    <w:tbl>
-      <w:tblPr>
-        <w:tblStyle w:val="LightGrid-Accent1"/>
-        <w:tblW w:type="auto" w:w="0"/>
-        <w:tblLook w:firstColumn="1" w:firstRow="1" w:lastColumn="0" w:lastRow="0" w:noHBand="0" w:noVBand="1" w:val="04A0"/>
-      </w:tblPr>
-      <w:tblGrid>
-        <w:gridCol w:w="4320"/>
-        <w:gridCol w:w="4320"/>
-      </w:tblGrid>
-      <w:tr>
-        <w:tc>
-          <w:tcPr>
-            <w:tcW w:type="dxa" w:w="4320"/>
-          </w:tcPr>
-          <w:p>
-            <w:r>
-              <w:t>타깃 이름</w:t>
-            </w:r>
-          </w:p>
-        </w:tc>
-        <w:tc>
-          <w:tcPr>
-            <w:tcW w:type="dxa" w:w="4320"/>
-          </w:tcPr>
-          <w:p>
-            <w:r>
-              <w:t>동작</w:t>
-            </w:r>
-          </w:p>
-        </w:tc>
-      </w:tr>
-      <w:tr>
-        <w:tc>
-          <w:tcPr>
-            <w:tcW w:type="dxa" w:w="4320"/>
-          </w:tcPr>
-          <w:p>
-            <w:r>
-              <w:t>velum_open</w:t>
-            </w:r>
-          </w:p>
-        </w:tc>
-        <w:tc>
-          <w:tcPr>
-            <w:tcW w:type="dxa" w:w="4320"/>
-          </w:tcPr>
-          <w:p>
-            <w:r>
-              <w:t>연구개·구개수 하강(비강 통로 개방=비음). 0=거상(구강), 1=하강(비강)</w:t>
-            </w:r>
-          </w:p>
-        </w:tc>
-      </w:tr>
-    </w:tbl>
-    <w:p>
-      <w:pPr>
-        <w:pStyle w:val="Heading2"/>
-      </w:pPr>
-      <w:r>
-        <w:t>턱 (Jaw)</w:t>
-      </w:r>
-    </w:p>
-    <w:tbl>
-      <w:tblPr>
-        <w:tblStyle w:val="LightGrid-Accent1"/>
-        <w:tblW w:type="auto" w:w="0"/>
-        <w:tblLook w:firstColumn="1" w:firstRow="1" w:lastColumn="0" w:lastRow="0" w:noHBand="0" w:noVBand="1" w:val="04A0"/>
-      </w:tblPr>
-      <w:tblGrid>
-        <w:gridCol w:w="4320"/>
-        <w:gridCol w:w="4320"/>
-      </w:tblGrid>
-      <w:tr>
-        <w:tc>
-          <w:tcPr>
-            <w:tcW w:type="dxa" w:w="4320"/>
-          </w:tcPr>
-          <w:p>
-            <w:r>
-              <w:t>타깃/본</w:t>
-            </w:r>
-          </w:p>
-        </w:tc>
-        <w:tc>
-          <w:tcPr>
-            <w:tcW w:type="dxa" w:w="4320"/>
-          </w:tcPr>
-          <w:p>
-            <w:r>
-              <w:t>동작</w:t>
-            </w:r>
-          </w:p>
-        </w:tc>
-      </w:tr>
-      <w:tr>
-        <w:tc>
-          <w:tcPr>
-            <w:tcW w:type="dxa" w:w="4320"/>
-          </w:tcPr>
-          <w:p>
-            <w:r>
-              <w:t>jaw_open</w:t>
-            </w:r>
-          </w:p>
-        </w:tc>
-        <w:tc>
-          <w:tcPr>
-            <w:tcW w:type="dxa" w:w="4320"/>
-          </w:tcPr>
-          <w:p>
-            <w:r>
-              <w:t>하악 회전 개구. (본이면 TMJ 피벗 회전, 최대 약 18–22°)</w:t>
-            </w:r>
-          </w:p>
-        </w:tc>
-      </w:tr>
-    </w:tbl>
-    <w:p>
-      <w:pPr>
-        <w:pStyle w:val="Heading2"/>
-      </w:pPr>
-      <w:r>
-        <w:t>입술 (Lips)</w:t>
-      </w:r>
-    </w:p>
-    <w:tbl>
-      <w:tblPr>
-        <w:tblStyle w:val="LightGrid-Accent1"/>
-        <w:tblW w:type="auto" w:w="0"/>
-        <w:tblLook w:firstColumn="1" w:firstRow="1" w:lastColumn="0" w:lastRow="0" w:noHBand="0" w:noVBand="1" w:val="04A0"/>
-      </w:tblPr>
-      <w:tblGrid>
-        <w:gridCol w:w="4320"/>
-        <w:gridCol w:w="4320"/>
-      </w:tblGrid>
-      <w:tr>
-        <w:tc>
-          <w:tcPr>
-            <w:tcW w:type="dxa" w:w="4320"/>
-          </w:tcPr>
-          <w:p>
-            <w:r>
-              <w:t>타깃 이름</w:t>
-            </w:r>
-          </w:p>
-        </w:tc>
-        <w:tc>
-          <w:tcPr>
-            <w:tcW w:type="dxa" w:w="4320"/>
-          </w:tcPr>
-          <w:p>
-            <w:r>
-              <w:t>동작</w:t>
-            </w:r>
-          </w:p>
-        </w:tc>
-      </w:tr>
-      <w:tr>
-        <w:tc>
-          <w:tcPr>
-            <w:tcW w:type="dxa" w:w="4320"/>
-          </w:tcPr>
-          <w:p>
-            <w:r>
-              <w:t>lips_closed</w:t>
-            </w:r>
-          </w:p>
-        </w:tc>
-        <w:tc>
-          <w:tcPr>
-            <w:tcW w:type="dxa" w:w="4320"/>
-          </w:tcPr>
-          <w:p>
-            <w:r>
-              <w:t>두 입술 폐쇄(양순음 /p,b,m/)</w:t>
-            </w:r>
-          </w:p>
-        </w:tc>
-      </w:tr>
-      <w:tr>
-        <w:tc>
-          <w:tcPr>
-            <w:tcW w:type="dxa" w:w="4320"/>
-          </w:tcPr>
-          <w:p>
-            <w:r>
-              <w:t>lips_round</w:t>
-            </w:r>
-          </w:p>
-        </w:tc>
-        <w:tc>
-          <w:tcPr>
-            <w:tcW w:type="dxa" w:w="4320"/>
-          </w:tcPr>
-          <w:p>
-            <w:r>
-              <w:t>원순(앞으로 모음, /u,o/)</w:t>
-            </w:r>
-          </w:p>
-        </w:tc>
-      </w:tr>
-      <w:tr>
-        <w:tc>
-          <w:tcPr>
-            <w:tcW w:type="dxa" w:w="4320"/>
-          </w:tcPr>
-          <w:p>
-            <w:r>
-              <w:t>lips_spread</w:t>
-            </w:r>
-          </w:p>
-        </w:tc>
-        <w:tc>
-          <w:tcPr>
-            <w:tcW w:type="dxa" w:w="4320"/>
-          </w:tcPr>
-          <w:p>
-            <w:r>
-              <w:t>좌우로 펼침(/i,e/)</w:t>
-            </w:r>
-          </w:p>
-        </w:tc>
-      </w:tr>
-    </w:tbl>
-    <w:p>
-      <w:r>
-        <w:t>모든 타깃은 상호 가산(addition) 가능해야 함 (예: lips_closed + velum_open = ㅁ).</w:t>
-      </w:r>
-    </w:p>
-    <w:p>
-      <w:pPr>
-        <w:pStyle w:val="Heading1"/>
-      </w:pPr>
-      <w:r>
-        <w:t>5. 한국어 음소 → 타깃 매핑 (검수 기준)</w:t>
-      </w:r>
-    </w:p>
-    <w:p>
-      <w:r>
-        <w:t>리거가 자연스러움을 확인하는 용도. 숫자는 대략적 가중치(0–1).</w:t>
-      </w:r>
-    </w:p>
-    <w:p>
-      <w:pPr>
-        <w:pStyle w:val="Heading2"/>
-      </w:pPr>
-      <w:r>
-        <w:t>자음</w:t>
+        <w:t>연구개 / 턱 / 입술 — 5개</w:t>
       </w:r>
     </w:p>
     <w:tbl>
@@ -748,7 +734,7 @@
           </w:tcPr>
           <w:p>
             <w:r>
-              <w:t>음소</w:t>
+              <w:t>#</w:t>
             </w:r>
           </w:p>
         </w:tc>
@@ -758,7 +744,7 @@
           </w:tcPr>
           <w:p>
             <w:r>
-              <w:t>조음위치/방법</w:t>
+              <w:t>타깃 이름</w:t>
             </w:r>
           </w:p>
         </w:tc>
@@ -768,7 +754,7 @@
           </w:tcPr>
           <w:p>
             <w:r>
-              <w:t>주요 타깃(가중치)</w:t>
+              <w:t>동작</w:t>
             </w:r>
           </w:p>
         </w:tc>
@@ -780,7 +766,7 @@
           </w:tcPr>
           <w:p>
             <w:r>
-              <w:t>ㅂ·ㅍ·ㅃ</w:t>
+              <w:t>8</w:t>
             </w:r>
           </w:p>
         </w:tc>
@@ -790,13 +776,254 @@
           </w:tcPr>
           <w:p>
             <w:r>
-              <w:t>양순 파열</w:t>
+              <w:t>velum_open</w:t>
             </w:r>
           </w:p>
         </w:tc>
         <w:tc>
           <w:tcPr>
             <w:tcW w:type="dxa" w:w="2880"/>
+          </w:tcPr>
+          <w:p>
+            <w:r>
+              <w:t>연구개·구개수 하강 (비강 개방). 0=거상, 1=하강</w:t>
+            </w:r>
+          </w:p>
+        </w:tc>
+      </w:tr>
+      <w:tr>
+        <w:tc>
+          <w:tcPr>
+            <w:tcW w:type="dxa" w:w="2880"/>
+          </w:tcPr>
+          <w:p>
+            <w:r>
+              <w:t>9</w:t>
+            </w:r>
+          </w:p>
+        </w:tc>
+        <w:tc>
+          <w:tcPr>
+            <w:tcW w:type="dxa" w:w="2880"/>
+          </w:tcPr>
+          <w:p>
+            <w:r>
+              <w:t>jaw_open</w:t>
+            </w:r>
+          </w:p>
+        </w:tc>
+        <w:tc>
+          <w:tcPr>
+            <w:tcW w:type="dxa" w:w="2880"/>
+          </w:tcPr>
+          <w:p>
+            <w:r>
+              <w:t>하악 회전 개구 (자연스러운 TMJ 회전, 최대 약 18–22°)</w:t>
+            </w:r>
+          </w:p>
+        </w:tc>
+      </w:tr>
+      <w:tr>
+        <w:tc>
+          <w:tcPr>
+            <w:tcW w:type="dxa" w:w="2880"/>
+          </w:tcPr>
+          <w:p>
+            <w:r>
+              <w:t>10</w:t>
+            </w:r>
+          </w:p>
+        </w:tc>
+        <w:tc>
+          <w:tcPr>
+            <w:tcW w:type="dxa" w:w="2880"/>
+          </w:tcPr>
+          <w:p>
+            <w:r>
+              <w:t>lips_closed</w:t>
+            </w:r>
+          </w:p>
+        </w:tc>
+        <w:tc>
+          <w:tcPr>
+            <w:tcW w:type="dxa" w:w="2880"/>
+          </w:tcPr>
+          <w:p>
+            <w:r>
+              <w:t>두 입술 폐쇄 (양순 폐쇄)</w:t>
+            </w:r>
+          </w:p>
+        </w:tc>
+      </w:tr>
+      <w:tr>
+        <w:tc>
+          <w:tcPr>
+            <w:tcW w:type="dxa" w:w="2880"/>
+          </w:tcPr>
+          <w:p>
+            <w:r>
+              <w:t>11</w:t>
+            </w:r>
+          </w:p>
+        </w:tc>
+        <w:tc>
+          <w:tcPr>
+            <w:tcW w:type="dxa" w:w="2880"/>
+          </w:tcPr>
+          <w:p>
+            <w:r>
+              <w:t>lips_round</w:t>
+            </w:r>
+          </w:p>
+        </w:tc>
+        <w:tc>
+          <w:tcPr>
+            <w:tcW w:type="dxa" w:w="2880"/>
+          </w:tcPr>
+          <w:p>
+            <w:r>
+              <w:t>원순 — 입술 앞으로 모음</w:t>
+            </w:r>
+          </w:p>
+        </w:tc>
+      </w:tr>
+      <w:tr>
+        <w:tc>
+          <w:tcPr>
+            <w:tcW w:type="dxa" w:w="2880"/>
+          </w:tcPr>
+          <w:p>
+            <w:r>
+              <w:t>12</w:t>
+            </w:r>
+          </w:p>
+        </w:tc>
+        <w:tc>
+          <w:tcPr>
+            <w:tcW w:type="dxa" w:w="2880"/>
+          </w:tcPr>
+          <w:p>
+            <w:r>
+              <w:t>lips_spread</w:t>
+            </w:r>
+          </w:p>
+        </w:tc>
+        <w:tc>
+          <w:tcPr>
+            <w:tcW w:type="dxa" w:w="2880"/>
+          </w:tcPr>
+          <w:p>
+            <w:r>
+              <w:t>좌우로 펼침</w:t>
+            </w:r>
+          </w:p>
+        </w:tc>
+      </w:tr>
+    </w:tbl>
+    <w:p>
+      <w:pPr>
+        <w:pStyle w:val="Heading1"/>
+      </w:pPr>
+      <w:r>
+        <w:t>5. 한국어 음소 → 타깃 매핑 (전부 실현 가능)</w:t>
+      </w:r>
+    </w:p>
+    <w:p>
+      <w:pPr>
+        <w:pStyle w:val="Heading2"/>
+      </w:pPr>
+      <w:r>
+        <w:t>5.1 자음 (19개)</w:t>
+      </w:r>
+    </w:p>
+    <w:tbl>
+      <w:tblPr>
+        <w:tblStyle w:val="LightGrid-Accent1"/>
+        <w:tblW w:type="auto" w:w="0"/>
+        <w:tblLook w:firstColumn="1" w:firstRow="1" w:lastColumn="0" w:lastRow="0" w:noHBand="0" w:noVBand="1" w:val="04A0"/>
+      </w:tblPr>
+      <w:tblGrid>
+        <w:gridCol w:w="2160"/>
+        <w:gridCol w:w="2160"/>
+        <w:gridCol w:w="2160"/>
+        <w:gridCol w:w="2160"/>
+      </w:tblGrid>
+      <w:tr>
+        <w:tc>
+          <w:tcPr>
+            <w:tcW w:type="dxa" w:w="2160"/>
+          </w:tcPr>
+          <w:p>
+            <w:r>
+              <w:t>음소</w:t>
+            </w:r>
+          </w:p>
+        </w:tc>
+        <w:tc>
+          <w:tcPr>
+            <w:tcW w:type="dxa" w:w="2160"/>
+          </w:tcPr>
+          <w:p>
+            <w:r>
+              <w:t>IPA</w:t>
+            </w:r>
+          </w:p>
+        </w:tc>
+        <w:tc>
+          <w:tcPr>
+            <w:tcW w:type="dxa" w:w="2160"/>
+          </w:tcPr>
+          <w:p>
+            <w:r>
+              <w:t>위치/방법</w:t>
+            </w:r>
+          </w:p>
+        </w:tc>
+        <w:tc>
+          <w:tcPr>
+            <w:tcW w:type="dxa" w:w="2160"/>
+          </w:tcPr>
+          <w:p>
+            <w:r>
+              <w:t>타깃 가중치</w:t>
+            </w:r>
+          </w:p>
+        </w:tc>
+      </w:tr>
+      <w:tr>
+        <w:tc>
+          <w:tcPr>
+            <w:tcW w:type="dxa" w:w="2160"/>
+          </w:tcPr>
+          <w:p>
+            <w:r>
+              <w:t>ㅂ</w:t>
+            </w:r>
+          </w:p>
+        </w:tc>
+        <w:tc>
+          <w:tcPr>
+            <w:tcW w:type="dxa" w:w="2160"/>
+          </w:tcPr>
+          <w:p>
+            <w:r>
+              <w:t>/p/</w:t>
+            </w:r>
+          </w:p>
+        </w:tc>
+        <w:tc>
+          <w:tcPr>
+            <w:tcW w:type="dxa" w:w="2160"/>
+          </w:tcPr>
+          <w:p>
+            <w:r>
+              <w:t>양순 평음 파열</w:t>
+            </w:r>
+          </w:p>
+        </w:tc>
+        <w:tc>
+          <w:tcPr>
+            <w:tcW w:type="dxa" w:w="2160"/>
           </w:tcPr>
           <w:p>
             <w:r>
@@ -808,7 +1035,91 @@
       <w:tr>
         <w:tc>
           <w:tcPr>
-            <w:tcW w:type="dxa" w:w="2880"/>
+            <w:tcW w:type="dxa" w:w="2160"/>
+          </w:tcPr>
+          <w:p>
+            <w:r>
+              <w:t>ㅍ</w:t>
+            </w:r>
+          </w:p>
+        </w:tc>
+        <w:tc>
+          <w:tcPr>
+            <w:tcW w:type="dxa" w:w="2160"/>
+          </w:tcPr>
+          <w:p>
+            <w:r>
+              <w:t>/pʰ/</w:t>
+            </w:r>
+          </w:p>
+        </w:tc>
+        <w:tc>
+          <w:tcPr>
+            <w:tcW w:type="dxa" w:w="2160"/>
+          </w:tcPr>
+          <w:p>
+            <w:r>
+              <w:t>양순 격음 파열</w:t>
+            </w:r>
+          </w:p>
+        </w:tc>
+        <w:tc>
+          <w:tcPr>
+            <w:tcW w:type="dxa" w:w="2160"/>
+          </w:tcPr>
+          <w:p>
+            <w:r>
+              <w:t>lips_closed(1) [+긴 기류]</w:t>
+            </w:r>
+          </w:p>
+        </w:tc>
+      </w:tr>
+      <w:tr>
+        <w:tc>
+          <w:tcPr>
+            <w:tcW w:type="dxa" w:w="2160"/>
+          </w:tcPr>
+          <w:p>
+            <w:r>
+              <w:t>ㅃ</w:t>
+            </w:r>
+          </w:p>
+        </w:tc>
+        <w:tc>
+          <w:tcPr>
+            <w:tcW w:type="dxa" w:w="2160"/>
+          </w:tcPr>
+          <w:p>
+            <w:r>
+              <w:t>/p͈/</w:t>
+            </w:r>
+          </w:p>
+        </w:tc>
+        <w:tc>
+          <w:tcPr>
+            <w:tcW w:type="dxa" w:w="2160"/>
+          </w:tcPr>
+          <w:p>
+            <w:r>
+              <w:t>양순 경음 파열</w:t>
+            </w:r>
+          </w:p>
+        </w:tc>
+        <w:tc>
+          <w:tcPr>
+            <w:tcW w:type="dxa" w:w="2160"/>
+          </w:tcPr>
+          <w:p>
+            <w:r>
+              <w:t>lips_closed(1) [+긴장]</w:t>
+            </w:r>
+          </w:p>
+        </w:tc>
+      </w:tr>
+      <w:tr>
+        <w:tc>
+          <w:tcPr>
+            <w:tcW w:type="dxa" w:w="2160"/>
           </w:tcPr>
           <w:p>
             <w:r>
@@ -818,7 +1129,17 @@
         </w:tc>
         <w:tc>
           <w:tcPr>
-            <w:tcW w:type="dxa" w:w="2880"/>
+            <w:tcW w:type="dxa" w:w="2160"/>
+          </w:tcPr>
+          <w:p>
+            <w:r>
+              <w:t>/m/</w:t>
+            </w:r>
+          </w:p>
+        </w:tc>
+        <w:tc>
+          <w:tcPr>
+            <w:tcW w:type="dxa" w:w="2160"/>
           </w:tcPr>
           <w:p>
             <w:r>
@@ -828,7 +1149,7 @@
         </w:tc>
         <w:tc>
           <w:tcPr>
-            <w:tcW w:type="dxa" w:w="2880"/>
+            <w:tcW w:type="dxa" w:w="2160"/>
           </w:tcPr>
           <w:p>
             <w:r>
@@ -840,27 +1161,37 @@
       <w:tr>
         <w:tc>
           <w:tcPr>
-            <w:tcW w:type="dxa" w:w="2880"/>
+            <w:tcW w:type="dxa" w:w="2160"/>
           </w:tcPr>
           <w:p>
             <w:r>
-              <w:t>ㄷ·ㅌ·ㄸ</w:t>
+              <w:t>ㄷ</w:t>
             </w:r>
           </w:p>
         </w:tc>
         <w:tc>
           <w:tcPr>
-            <w:tcW w:type="dxa" w:w="2880"/>
+            <w:tcW w:type="dxa" w:w="2160"/>
           </w:tcPr>
           <w:p>
             <w:r>
-              <w:t>치조 파열</w:t>
+              <w:t>/t/</w:t>
             </w:r>
           </w:p>
         </w:tc>
         <w:tc>
           <w:tcPr>
-            <w:tcW w:type="dxa" w:w="2880"/>
+            <w:tcW w:type="dxa" w:w="2160"/>
+          </w:tcPr>
+          <w:p>
+            <w:r>
+              <w:t>치조 평음 파열</w:t>
+            </w:r>
+          </w:p>
+        </w:tc>
+        <w:tc>
+          <w:tcPr>
+            <w:tcW w:type="dxa" w:w="2160"/>
           </w:tcPr>
           <w:p>
             <w:r>
@@ -872,7 +1203,91 @@
       <w:tr>
         <w:tc>
           <w:tcPr>
-            <w:tcW w:type="dxa" w:w="2880"/>
+            <w:tcW w:type="dxa" w:w="2160"/>
+          </w:tcPr>
+          <w:p>
+            <w:r>
+              <w:t>ㅌ</w:t>
+            </w:r>
+          </w:p>
+        </w:tc>
+        <w:tc>
+          <w:tcPr>
+            <w:tcW w:type="dxa" w:w="2160"/>
+          </w:tcPr>
+          <w:p>
+            <w:r>
+              <w:t>/tʰ/</w:t>
+            </w:r>
+          </w:p>
+        </w:tc>
+        <w:tc>
+          <w:tcPr>
+            <w:tcW w:type="dxa" w:w="2160"/>
+          </w:tcPr>
+          <w:p>
+            <w:r>
+              <w:t>치조 격음 파열</w:t>
+            </w:r>
+          </w:p>
+        </w:tc>
+        <w:tc>
+          <w:tcPr>
+            <w:tcW w:type="dxa" w:w="2160"/>
+          </w:tcPr>
+          <w:p>
+            <w:r>
+              <w:t>tongue_tip_up(1) + jaw_open(0.2)</w:t>
+            </w:r>
+          </w:p>
+        </w:tc>
+      </w:tr>
+      <w:tr>
+        <w:tc>
+          <w:tcPr>
+            <w:tcW w:type="dxa" w:w="2160"/>
+          </w:tcPr>
+          <w:p>
+            <w:r>
+              <w:t>ㄸ</w:t>
+            </w:r>
+          </w:p>
+        </w:tc>
+        <w:tc>
+          <w:tcPr>
+            <w:tcW w:type="dxa" w:w="2160"/>
+          </w:tcPr>
+          <w:p>
+            <w:r>
+              <w:t>/t͈/</w:t>
+            </w:r>
+          </w:p>
+        </w:tc>
+        <w:tc>
+          <w:tcPr>
+            <w:tcW w:type="dxa" w:w="2160"/>
+          </w:tcPr>
+          <w:p>
+            <w:r>
+              <w:t>치조 경음 파열</w:t>
+            </w:r>
+          </w:p>
+        </w:tc>
+        <w:tc>
+          <w:tcPr>
+            <w:tcW w:type="dxa" w:w="2160"/>
+          </w:tcPr>
+          <w:p>
+            <w:r>
+              <w:t>tongue_tip_up(1) + jaw_open(0.2)</w:t>
+            </w:r>
+          </w:p>
+        </w:tc>
+      </w:tr>
+      <w:tr>
+        <w:tc>
+          <w:tcPr>
+            <w:tcW w:type="dxa" w:w="2160"/>
           </w:tcPr>
           <w:p>
             <w:r>
@@ -882,7 +1297,17 @@
         </w:tc>
         <w:tc>
           <w:tcPr>
-            <w:tcW w:type="dxa" w:w="2880"/>
+            <w:tcW w:type="dxa" w:w="2160"/>
+          </w:tcPr>
+          <w:p>
+            <w:r>
+              <w:t>/n/</w:t>
+            </w:r>
+          </w:p>
+        </w:tc>
+        <w:tc>
+          <w:tcPr>
+            <w:tcW w:type="dxa" w:w="2160"/>
           </w:tcPr>
           <w:p>
             <w:r>
@@ -892,7 +1317,7 @@
         </w:tc>
         <w:tc>
           <w:tcPr>
-            <w:tcW w:type="dxa" w:w="2880"/>
+            <w:tcW w:type="dxa" w:w="2160"/>
           </w:tcPr>
           <w:p>
             <w:r>
@@ -904,27 +1329,37 @@
       <w:tr>
         <w:tc>
           <w:tcPr>
-            <w:tcW w:type="dxa" w:w="2880"/>
+            <w:tcW w:type="dxa" w:w="2160"/>
           </w:tcPr>
           <w:p>
             <w:r>
-              <w:t>ㅅ·ㅆ</w:t>
+              <w:t>ㅅ</w:t>
             </w:r>
           </w:p>
         </w:tc>
         <w:tc>
           <w:tcPr>
-            <w:tcW w:type="dxa" w:w="2880"/>
+            <w:tcW w:type="dxa" w:w="2160"/>
           </w:tcPr>
           <w:p>
             <w:r>
-              <w:t>치조 마찰</w:t>
+              <w:t>/s/</w:t>
             </w:r>
           </w:p>
         </w:tc>
         <w:tc>
           <w:tcPr>
-            <w:tcW w:type="dxa" w:w="2880"/>
+            <w:tcW w:type="dxa" w:w="2160"/>
+          </w:tcPr>
+          <w:p>
+            <w:r>
+              <w:t>치조 평음 마찰</w:t>
+            </w:r>
+          </w:p>
+        </w:tc>
+        <w:tc>
+          <w:tcPr>
+            <w:tcW w:type="dxa" w:w="2160"/>
           </w:tcPr>
           <w:p>
             <w:r>
@@ -936,27 +1371,79 @@
       <w:tr>
         <w:tc>
           <w:tcPr>
-            <w:tcW w:type="dxa" w:w="2880"/>
+            <w:tcW w:type="dxa" w:w="2160"/>
           </w:tcPr>
           <w:p>
             <w:r>
-              <w:t>ㅈ·ㅊ·ㅉ</w:t>
+              <w:t>ㅆ</w:t>
             </w:r>
           </w:p>
         </w:tc>
         <w:tc>
           <w:tcPr>
-            <w:tcW w:type="dxa" w:w="2880"/>
+            <w:tcW w:type="dxa" w:w="2160"/>
           </w:tcPr>
           <w:p>
             <w:r>
-              <w:t>치경경구개 파찰</w:t>
+              <w:t>/s͈/</w:t>
             </w:r>
           </w:p>
         </w:tc>
         <w:tc>
           <w:tcPr>
-            <w:tcW w:type="dxa" w:w="2880"/>
+            <w:tcW w:type="dxa" w:w="2160"/>
+          </w:tcPr>
+          <w:p>
+            <w:r>
+              <w:t>치조 경음 마찰</w:t>
+            </w:r>
+          </w:p>
+        </w:tc>
+        <w:tc>
+          <w:tcPr>
+            <w:tcW w:type="dxa" w:w="2160"/>
+          </w:tcPr>
+          <w:p>
+            <w:r>
+              <w:t>tongue_tip_up(0.7) + tongue_groove(1) + jaw_open(0.3)</w:t>
+            </w:r>
+          </w:p>
+        </w:tc>
+      </w:tr>
+      <w:tr>
+        <w:tc>
+          <w:tcPr>
+            <w:tcW w:type="dxa" w:w="2160"/>
+          </w:tcPr>
+          <w:p>
+            <w:r>
+              <w:t>ㅈ</w:t>
+            </w:r>
+          </w:p>
+        </w:tc>
+        <w:tc>
+          <w:tcPr>
+            <w:tcW w:type="dxa" w:w="2160"/>
+          </w:tcPr>
+          <w:p>
+            <w:r>
+              <w:t>/tɕ/</w:t>
+            </w:r>
+          </w:p>
+        </w:tc>
+        <w:tc>
+          <w:tcPr>
+            <w:tcW w:type="dxa" w:w="2160"/>
+          </w:tcPr>
+          <w:p>
+            <w:r>
+              <w:t>치경경구개 평음 파찰</w:t>
+            </w:r>
+          </w:p>
+        </w:tc>
+        <w:tc>
+          <w:tcPr>
+            <w:tcW w:type="dxa" w:w="2160"/>
           </w:tcPr>
           <w:p>
             <w:r>
@@ -968,27 +1455,121 @@
       <w:tr>
         <w:tc>
           <w:tcPr>
-            <w:tcW w:type="dxa" w:w="2880"/>
+            <w:tcW w:type="dxa" w:w="2160"/>
           </w:tcPr>
           <w:p>
             <w:r>
-              <w:t>ㄱ·ㅋ·ㄲ</w:t>
+              <w:t>ㅊ</w:t>
             </w:r>
           </w:p>
         </w:tc>
         <w:tc>
           <w:tcPr>
-            <w:tcW w:type="dxa" w:w="2880"/>
+            <w:tcW w:type="dxa" w:w="2160"/>
           </w:tcPr>
           <w:p>
             <w:r>
-              <w:t>연구개 파열</w:t>
+              <w:t>/tɕʰ/</w:t>
             </w:r>
           </w:p>
         </w:tc>
         <w:tc>
           <w:tcPr>
-            <w:tcW w:type="dxa" w:w="2880"/>
+            <w:tcW w:type="dxa" w:w="2160"/>
+          </w:tcPr>
+          <w:p>
+            <w:r>
+              <w:t>치경경구개 격음 파찰</w:t>
+            </w:r>
+          </w:p>
+        </w:tc>
+        <w:tc>
+          <w:tcPr>
+            <w:tcW w:type="dxa" w:w="2160"/>
+          </w:tcPr>
+          <w:p>
+            <w:r>
+              <w:t>tongue_front_up(1) + tongue_groove(0.5)</w:t>
+            </w:r>
+          </w:p>
+        </w:tc>
+      </w:tr>
+      <w:tr>
+        <w:tc>
+          <w:tcPr>
+            <w:tcW w:type="dxa" w:w="2160"/>
+          </w:tcPr>
+          <w:p>
+            <w:r>
+              <w:t>ㅉ</w:t>
+            </w:r>
+          </w:p>
+        </w:tc>
+        <w:tc>
+          <w:tcPr>
+            <w:tcW w:type="dxa" w:w="2160"/>
+          </w:tcPr>
+          <w:p>
+            <w:r>
+              <w:t>/tɕ͈/</w:t>
+            </w:r>
+          </w:p>
+        </w:tc>
+        <w:tc>
+          <w:tcPr>
+            <w:tcW w:type="dxa" w:w="2160"/>
+          </w:tcPr>
+          <w:p>
+            <w:r>
+              <w:t>치경경구개 경음 파찰</w:t>
+            </w:r>
+          </w:p>
+        </w:tc>
+        <w:tc>
+          <w:tcPr>
+            <w:tcW w:type="dxa" w:w="2160"/>
+          </w:tcPr>
+          <w:p>
+            <w:r>
+              <w:t>tongue_front_up(1) + tongue_groove(0.5)</w:t>
+            </w:r>
+          </w:p>
+        </w:tc>
+      </w:tr>
+      <w:tr>
+        <w:tc>
+          <w:tcPr>
+            <w:tcW w:type="dxa" w:w="2160"/>
+          </w:tcPr>
+          <w:p>
+            <w:r>
+              <w:t>ㄱ</w:t>
+            </w:r>
+          </w:p>
+        </w:tc>
+        <w:tc>
+          <w:tcPr>
+            <w:tcW w:type="dxa" w:w="2160"/>
+          </w:tcPr>
+          <w:p>
+            <w:r>
+              <w:t>/k/</w:t>
+            </w:r>
+          </w:p>
+        </w:tc>
+        <w:tc>
+          <w:tcPr>
+            <w:tcW w:type="dxa" w:w="2160"/>
+          </w:tcPr>
+          <w:p>
+            <w:r>
+              <w:t>연구개 평음 파열</w:t>
+            </w:r>
+          </w:p>
+        </w:tc>
+        <w:tc>
+          <w:tcPr>
+            <w:tcW w:type="dxa" w:w="2160"/>
           </w:tcPr>
           <w:p>
             <w:r>
@@ -1000,7 +1581,91 @@
       <w:tr>
         <w:tc>
           <w:tcPr>
-            <w:tcW w:type="dxa" w:w="2880"/>
+            <w:tcW w:type="dxa" w:w="2160"/>
+          </w:tcPr>
+          <w:p>
+            <w:r>
+              <w:t>ㅋ</w:t>
+            </w:r>
+          </w:p>
+        </w:tc>
+        <w:tc>
+          <w:tcPr>
+            <w:tcW w:type="dxa" w:w="2160"/>
+          </w:tcPr>
+          <w:p>
+            <w:r>
+              <w:t>/kʰ/</w:t>
+            </w:r>
+          </w:p>
+        </w:tc>
+        <w:tc>
+          <w:tcPr>
+            <w:tcW w:type="dxa" w:w="2160"/>
+          </w:tcPr>
+          <w:p>
+            <w:r>
+              <w:t>연구개 격음 파열</w:t>
+            </w:r>
+          </w:p>
+        </w:tc>
+        <w:tc>
+          <w:tcPr>
+            <w:tcW w:type="dxa" w:w="2160"/>
+          </w:tcPr>
+          <w:p>
+            <w:r>
+              <w:t>tongue_back_up(1)</w:t>
+            </w:r>
+          </w:p>
+        </w:tc>
+      </w:tr>
+      <w:tr>
+        <w:tc>
+          <w:tcPr>
+            <w:tcW w:type="dxa" w:w="2160"/>
+          </w:tcPr>
+          <w:p>
+            <w:r>
+              <w:t>ㄲ</w:t>
+            </w:r>
+          </w:p>
+        </w:tc>
+        <w:tc>
+          <w:tcPr>
+            <w:tcW w:type="dxa" w:w="2160"/>
+          </w:tcPr>
+          <w:p>
+            <w:r>
+              <w:t>/k͈/</w:t>
+            </w:r>
+          </w:p>
+        </w:tc>
+        <w:tc>
+          <w:tcPr>
+            <w:tcW w:type="dxa" w:w="2160"/>
+          </w:tcPr>
+          <w:p>
+            <w:r>
+              <w:t>연구개 경음 파열</w:t>
+            </w:r>
+          </w:p>
+        </w:tc>
+        <w:tc>
+          <w:tcPr>
+            <w:tcW w:type="dxa" w:w="2160"/>
+          </w:tcPr>
+          <w:p>
+            <w:r>
+              <w:t>tongue_back_up(1)</w:t>
+            </w:r>
+          </w:p>
+        </w:tc>
+      </w:tr>
+      <w:tr>
+        <w:tc>
+          <w:tcPr>
+            <w:tcW w:type="dxa" w:w="2160"/>
           </w:tcPr>
           <w:p>
             <w:r>
@@ -1010,7 +1675,17 @@
         </w:tc>
         <w:tc>
           <w:tcPr>
-            <w:tcW w:type="dxa" w:w="2880"/>
+            <w:tcW w:type="dxa" w:w="2160"/>
+          </w:tcPr>
+          <w:p>
+            <w:r>
+              <w:t>/ŋ/</w:t>
+            </w:r>
+          </w:p>
+        </w:tc>
+        <w:tc>
+          <w:tcPr>
+            <w:tcW w:type="dxa" w:w="2160"/>
           </w:tcPr>
           <w:p>
             <w:r>
@@ -1020,7 +1695,7 @@
         </w:tc>
         <w:tc>
           <w:tcPr>
-            <w:tcW w:type="dxa" w:w="2880"/>
+            <w:tcW w:type="dxa" w:w="2160"/>
           </w:tcPr>
           <w:p>
             <w:r>
@@ -1032,31 +1707,41 @@
       <w:tr>
         <w:tc>
           <w:tcPr>
-            <w:tcW w:type="dxa" w:w="2880"/>
+            <w:tcW w:type="dxa" w:w="2160"/>
           </w:tcPr>
           <w:p>
             <w:r>
-              <w:t>ㄹ</w:t>
+              <w:t>ㄹ (탄설)</w:t>
             </w:r>
           </w:p>
         </w:tc>
         <w:tc>
           <w:tcPr>
-            <w:tcW w:type="dxa" w:w="2880"/>
+            <w:tcW w:type="dxa" w:w="2160"/>
           </w:tcPr>
           <w:p>
             <w:r>
-              <w:t>치조 탄설/설측</w:t>
+              <w:t>/ɾ/</w:t>
             </w:r>
           </w:p>
         </w:tc>
         <w:tc>
           <w:tcPr>
-            <w:tcW w:type="dxa" w:w="2880"/>
+            <w:tcW w:type="dxa" w:w="2160"/>
           </w:tcPr>
           <w:p>
             <w:r>
-              <w:t>tongue_tip_up(0.8)</w:t>
+              <w:t>치조 탄설 (모음 사이)</w:t>
+            </w:r>
+          </w:p>
+        </w:tc>
+        <w:tc>
+          <w:tcPr>
+            <w:tcW w:type="dxa" w:w="2160"/>
+          </w:tcPr>
+          <w:p>
+            <w:r>
+              <w:t>tongue_tip_up(1) [짧게 반복]</w:t>
             </w:r>
           </w:p>
         </w:tc>
@@ -1064,7 +1749,49 @@
       <w:tr>
         <w:tc>
           <w:tcPr>
-            <w:tcW w:type="dxa" w:w="2880"/>
+            <w:tcW w:type="dxa" w:w="2160"/>
+          </w:tcPr>
+          <w:p>
+            <w:r>
+              <w:t>ㄹ (설측)</w:t>
+            </w:r>
+          </w:p>
+        </w:tc>
+        <w:tc>
+          <w:tcPr>
+            <w:tcW w:type="dxa" w:w="2160"/>
+          </w:tcPr>
+          <w:p>
+            <w:r>
+              <w:t>/l/</w:t>
+            </w:r>
+          </w:p>
+        </w:tc>
+        <w:tc>
+          <w:tcPr>
+            <w:tcW w:type="dxa" w:w="2160"/>
+          </w:tcPr>
+          <w:p>
+            <w:r>
+              <w:t>치조 설측 (어말/겹침)</w:t>
+            </w:r>
+          </w:p>
+        </w:tc>
+        <w:tc>
+          <w:tcPr>
+            <w:tcW w:type="dxa" w:w="2160"/>
+          </w:tcPr>
+          <w:p>
+            <w:r>
+              <w:t>tongue_tip_up(0.9) + tongue_lateral_channel(1)</w:t>
+            </w:r>
+          </w:p>
+        </w:tc>
+      </w:tr>
+      <w:tr>
+        <w:tc>
+          <w:tcPr>
+            <w:tcW w:type="dxa" w:w="2160"/>
           </w:tcPr>
           <w:p>
             <w:r>
@@ -1074,7 +1801,17 @@
         </w:tc>
         <w:tc>
           <w:tcPr>
-            <w:tcW w:type="dxa" w:w="2880"/>
+            <w:tcW w:type="dxa" w:w="2160"/>
+          </w:tcPr>
+          <w:p>
+            <w:r>
+              <w:t>/h/</w:t>
+            </w:r>
+          </w:p>
+        </w:tc>
+        <w:tc>
+          <w:tcPr>
+            <w:tcW w:type="dxa" w:w="2160"/>
           </w:tcPr>
           <w:p>
             <w:r>
@@ -1084,11 +1821,1034 @@
         </w:tc>
         <w:tc>
           <w:tcPr>
-            <w:tcW w:type="dxa" w:w="2880"/>
+            <w:tcW w:type="dxa" w:w="2160"/>
           </w:tcPr>
           <w:p>
             <w:r>
-              <w:t>jaw_open(0.3) (구강 타깃 거의 없음)</w:t>
+              <w:t>jaw_open(0.3) (구강 변형 거의 없음)</w:t>
+            </w:r>
+          </w:p>
+        </w:tc>
+      </w:tr>
+    </w:tbl>
+    <w:p>
+      <w:r>
+        <w:t>※ 평음/격음/경음(ㅂ/ㅍ/ㅃ 등)은 같은 조음 형태, 기류 강도·긴장도만 다름 → 같은 블렌드셰이프, 코드에서 기류 강도로 구분.</w:t>
+      </w:r>
+    </w:p>
+    <w:p>
+      <w:pPr>
+        <w:pStyle w:val="Heading2"/>
+      </w:pPr>
+      <w:r>
+        <w:t>5.2 단모음 (10개)</w:t>
+      </w:r>
+    </w:p>
+    <w:tbl>
+      <w:tblPr>
+        <w:tblStyle w:val="LightGrid-Accent1"/>
+        <w:tblW w:type="auto" w:w="0"/>
+        <w:tblLook w:firstColumn="1" w:firstRow="1" w:lastColumn="0" w:lastRow="0" w:noHBand="0" w:noVBand="1" w:val="04A0"/>
+      </w:tblPr>
+      <w:tblGrid>
+        <w:gridCol w:w="2160"/>
+        <w:gridCol w:w="2160"/>
+        <w:gridCol w:w="2160"/>
+        <w:gridCol w:w="2160"/>
+      </w:tblGrid>
+      <w:tr>
+        <w:tc>
+          <w:tcPr>
+            <w:tcW w:type="dxa" w:w="2160"/>
+          </w:tcPr>
+          <w:p>
+            <w:r>
+              <w:t>모음</w:t>
+            </w:r>
+          </w:p>
+        </w:tc>
+        <w:tc>
+          <w:tcPr>
+            <w:tcW w:type="dxa" w:w="2160"/>
+          </w:tcPr>
+          <w:p>
+            <w:r>
+              <w:t>IPA</w:t>
+            </w:r>
+          </w:p>
+        </w:tc>
+        <w:tc>
+          <w:tcPr>
+            <w:tcW w:type="dxa" w:w="2160"/>
+          </w:tcPr>
+          <w:p>
+            <w:r>
+              <w:t>특성</w:t>
+            </w:r>
+          </w:p>
+        </w:tc>
+        <w:tc>
+          <w:tcPr>
+            <w:tcW w:type="dxa" w:w="2160"/>
+          </w:tcPr>
+          <w:p>
+            <w:r>
+              <w:t>타깃 가중치</w:t>
+            </w:r>
+          </w:p>
+        </w:tc>
+      </w:tr>
+      <w:tr>
+        <w:tc>
+          <w:tcPr>
+            <w:tcW w:type="dxa" w:w="2160"/>
+          </w:tcPr>
+          <w:p>
+            <w:r>
+              <w:t>ㅏ</w:t>
+            </w:r>
+          </w:p>
+        </w:tc>
+        <w:tc>
+          <w:tcPr>
+            <w:tcW w:type="dxa" w:w="2160"/>
+          </w:tcPr>
+          <w:p>
+            <w:r>
+              <w:t>/a/</w:t>
+            </w:r>
+          </w:p>
+        </w:tc>
+        <w:tc>
+          <w:tcPr>
+            <w:tcW w:type="dxa" w:w="2160"/>
+          </w:tcPr>
+          <w:p>
+            <w:r>
+              <w:t>저·중앙/후, 평순</w:t>
+            </w:r>
+          </w:p>
+        </w:tc>
+        <w:tc>
+          <w:tcPr>
+            <w:tcW w:type="dxa" w:w="2160"/>
+          </w:tcPr>
+          <w:p>
+            <w:r>
+              <w:t>jaw_open(0.8) + tongue_retract(0.2)</w:t>
+            </w:r>
+          </w:p>
+        </w:tc>
+      </w:tr>
+      <w:tr>
+        <w:tc>
+          <w:tcPr>
+            <w:tcW w:type="dxa" w:w="2160"/>
+          </w:tcPr>
+          <w:p>
+            <w:r>
+              <w:t>ㅓ</w:t>
+            </w:r>
+          </w:p>
+        </w:tc>
+        <w:tc>
+          <w:tcPr>
+            <w:tcW w:type="dxa" w:w="2160"/>
+          </w:tcPr>
+          <w:p>
+            <w:r>
+              <w:t>/ʌ/</w:t>
+            </w:r>
+          </w:p>
+        </w:tc>
+        <w:tc>
+          <w:tcPr>
+            <w:tcW w:type="dxa" w:w="2160"/>
+          </w:tcPr>
+          <w:p>
+            <w:r>
+              <w:t>중·후, 평순</w:t>
+            </w:r>
+          </w:p>
+        </w:tc>
+        <w:tc>
+          <w:tcPr>
+            <w:tcW w:type="dxa" w:w="2160"/>
+          </w:tcPr>
+          <w:p>
+            <w:r>
+              <w:t>jaw_open(0.5) + tongue_retract(0.2)</w:t>
+            </w:r>
+          </w:p>
+        </w:tc>
+      </w:tr>
+      <w:tr>
+        <w:tc>
+          <w:tcPr>
+            <w:tcW w:type="dxa" w:w="2160"/>
+          </w:tcPr>
+          <w:p>
+            <w:r>
+              <w:t>ㅗ</w:t>
+            </w:r>
+          </w:p>
+        </w:tc>
+        <w:tc>
+          <w:tcPr>
+            <w:tcW w:type="dxa" w:w="2160"/>
+          </w:tcPr>
+          <w:p>
+            <w:r>
+              <w:t>/o/</w:t>
+            </w:r>
+          </w:p>
+        </w:tc>
+        <w:tc>
+          <w:tcPr>
+            <w:tcW w:type="dxa" w:w="2160"/>
+          </w:tcPr>
+          <w:p>
+            <w:r>
+              <w:t>중·후, 원순</w:t>
+            </w:r>
+          </w:p>
+        </w:tc>
+        <w:tc>
+          <w:tcPr>
+            <w:tcW w:type="dxa" w:w="2160"/>
+          </w:tcPr>
+          <w:p>
+            <w:r>
+              <w:t>jaw_open(0.4) + lips_round(0.7) + tongue_back_up(0.3)</w:t>
+            </w:r>
+          </w:p>
+        </w:tc>
+      </w:tr>
+      <w:tr>
+        <w:tc>
+          <w:tcPr>
+            <w:tcW w:type="dxa" w:w="2160"/>
+          </w:tcPr>
+          <w:p>
+            <w:r>
+              <w:t>ㅜ</w:t>
+            </w:r>
+          </w:p>
+        </w:tc>
+        <w:tc>
+          <w:tcPr>
+            <w:tcW w:type="dxa" w:w="2160"/>
+          </w:tcPr>
+          <w:p>
+            <w:r>
+              <w:t>/u/</w:t>
+            </w:r>
+          </w:p>
+        </w:tc>
+        <w:tc>
+          <w:tcPr>
+            <w:tcW w:type="dxa" w:w="2160"/>
+          </w:tcPr>
+          <w:p>
+            <w:r>
+              <w:t>고·후, 원순</w:t>
+            </w:r>
+          </w:p>
+        </w:tc>
+        <w:tc>
+          <w:tcPr>
+            <w:tcW w:type="dxa" w:w="2160"/>
+          </w:tcPr>
+          <w:p>
+            <w:r>
+              <w:t>lips_round(1) + tongue_back_up(0.6)</w:t>
+            </w:r>
+          </w:p>
+        </w:tc>
+      </w:tr>
+      <w:tr>
+        <w:tc>
+          <w:tcPr>
+            <w:tcW w:type="dxa" w:w="2160"/>
+          </w:tcPr>
+          <w:p>
+            <w:r>
+              <w:t>ㅡ</w:t>
+            </w:r>
+          </w:p>
+        </w:tc>
+        <w:tc>
+          <w:tcPr>
+            <w:tcW w:type="dxa" w:w="2160"/>
+          </w:tcPr>
+          <w:p>
+            <w:r>
+              <w:t>/ɯ/</w:t>
+            </w:r>
+          </w:p>
+        </w:tc>
+        <w:tc>
+          <w:tcPr>
+            <w:tcW w:type="dxa" w:w="2160"/>
+          </w:tcPr>
+          <w:p>
+            <w:r>
+              <w:t>고·후, 평순</w:t>
+            </w:r>
+          </w:p>
+        </w:tc>
+        <w:tc>
+          <w:tcPr>
+            <w:tcW w:type="dxa" w:w="2160"/>
+          </w:tcPr>
+          <w:p>
+            <w:r>
+              <w:t>tongue_back_up(0.5)</w:t>
+            </w:r>
+          </w:p>
+        </w:tc>
+      </w:tr>
+      <w:tr>
+        <w:tc>
+          <w:tcPr>
+            <w:tcW w:type="dxa" w:w="2160"/>
+          </w:tcPr>
+          <w:p>
+            <w:r>
+              <w:t>ㅣ</w:t>
+            </w:r>
+          </w:p>
+        </w:tc>
+        <w:tc>
+          <w:tcPr>
+            <w:tcW w:type="dxa" w:w="2160"/>
+          </w:tcPr>
+          <w:p>
+            <w:r>
+              <w:t>/i/</w:t>
+            </w:r>
+          </w:p>
+        </w:tc>
+        <w:tc>
+          <w:tcPr>
+            <w:tcW w:type="dxa" w:w="2160"/>
+          </w:tcPr>
+          <w:p>
+            <w:r>
+              <w:t>고·전, 평순</w:t>
+            </w:r>
+          </w:p>
+        </w:tc>
+        <w:tc>
+          <w:tcPr>
+            <w:tcW w:type="dxa" w:w="2160"/>
+          </w:tcPr>
+          <w:p>
+            <w:r>
+              <w:t>tongue_front_up(0.8) + lips_spread(0.6)</w:t>
+            </w:r>
+          </w:p>
+        </w:tc>
+      </w:tr>
+      <w:tr>
+        <w:tc>
+          <w:tcPr>
+            <w:tcW w:type="dxa" w:w="2160"/>
+          </w:tcPr>
+          <w:p>
+            <w:r>
+              <w:t>ㅔ</w:t>
+            </w:r>
+          </w:p>
+        </w:tc>
+        <w:tc>
+          <w:tcPr>
+            <w:tcW w:type="dxa" w:w="2160"/>
+          </w:tcPr>
+          <w:p>
+            <w:r>
+              <w:t>/e/</w:t>
+            </w:r>
+          </w:p>
+        </w:tc>
+        <w:tc>
+          <w:tcPr>
+            <w:tcW w:type="dxa" w:w="2160"/>
+          </w:tcPr>
+          <w:p>
+            <w:r>
+              <w:t>중·전, 평순</w:t>
+            </w:r>
+          </w:p>
+        </w:tc>
+        <w:tc>
+          <w:tcPr>
+            <w:tcW w:type="dxa" w:w="2160"/>
+          </w:tcPr>
+          <w:p>
+            <w:r>
+              <w:t>tongue_front_up(0.4) + lips_spread(0.3) + jaw_open(0.3)</w:t>
+            </w:r>
+          </w:p>
+        </w:tc>
+      </w:tr>
+      <w:tr>
+        <w:tc>
+          <w:tcPr>
+            <w:tcW w:type="dxa" w:w="2160"/>
+          </w:tcPr>
+          <w:p>
+            <w:r>
+              <w:t>ㅐ</w:t>
+            </w:r>
+          </w:p>
+        </w:tc>
+        <w:tc>
+          <w:tcPr>
+            <w:tcW w:type="dxa" w:w="2160"/>
+          </w:tcPr>
+          <w:p>
+            <w:r>
+              <w:t>/ɛ/</w:t>
+            </w:r>
+          </w:p>
+        </w:tc>
+        <w:tc>
+          <w:tcPr>
+            <w:tcW w:type="dxa" w:w="2160"/>
+          </w:tcPr>
+          <w:p>
+            <w:r>
+              <w:t>개중·전, 평순</w:t>
+            </w:r>
+          </w:p>
+        </w:tc>
+        <w:tc>
+          <w:tcPr>
+            <w:tcW w:type="dxa" w:w="2160"/>
+          </w:tcPr>
+          <w:p>
+            <w:r>
+              <w:t>tongue_front_up(0.3) + lips_spread(0.3) + jaw_open(0.4)</w:t>
+            </w:r>
+          </w:p>
+        </w:tc>
+      </w:tr>
+      <w:tr>
+        <w:tc>
+          <w:tcPr>
+            <w:tcW w:type="dxa" w:w="2160"/>
+          </w:tcPr>
+          <w:p>
+            <w:r>
+              <w:t>ㅚ</w:t>
+            </w:r>
+          </w:p>
+        </w:tc>
+        <w:tc>
+          <w:tcPr>
+            <w:tcW w:type="dxa" w:w="2160"/>
+          </w:tcPr>
+          <w:p>
+            <w:r>
+              <w:t>/ø/→[we]</w:t>
+            </w:r>
+          </w:p>
+        </w:tc>
+        <w:tc>
+          <w:tcPr>
+            <w:tcW w:type="dxa" w:w="2160"/>
+          </w:tcPr>
+          <w:p>
+            <w:r>
+              <w:t>현대 이중모음화</w:t>
+            </w:r>
+          </w:p>
+        </w:tc>
+        <w:tc>
+          <w:tcPr>
+            <w:tcW w:type="dxa" w:w="2160"/>
+          </w:tcPr>
+          <w:p>
+            <w:r>
+              <w:t>ㅜ → ㅔ 보간 (5.3 참고)</w:t>
+            </w:r>
+          </w:p>
+        </w:tc>
+      </w:tr>
+      <w:tr>
+        <w:tc>
+          <w:tcPr>
+            <w:tcW w:type="dxa" w:w="2160"/>
+          </w:tcPr>
+          <w:p>
+            <w:r>
+              <w:t>ㅟ</w:t>
+            </w:r>
+          </w:p>
+        </w:tc>
+        <w:tc>
+          <w:tcPr>
+            <w:tcW w:type="dxa" w:w="2160"/>
+          </w:tcPr>
+          <w:p>
+            <w:r>
+              <w:t>/y/→[wi]</w:t>
+            </w:r>
+          </w:p>
+        </w:tc>
+        <w:tc>
+          <w:tcPr>
+            <w:tcW w:type="dxa" w:w="2160"/>
+          </w:tcPr>
+          <w:p>
+            <w:r>
+              <w:t>현대 이중모음화</w:t>
+            </w:r>
+          </w:p>
+        </w:tc>
+        <w:tc>
+          <w:tcPr>
+            <w:tcW w:type="dxa" w:w="2160"/>
+          </w:tcPr>
+          <w:p>
+            <w:r>
+              <w:t>ㅜ → ㅣ 보간 (5.3 참고)</w:t>
+            </w:r>
+          </w:p>
+        </w:tc>
+      </w:tr>
+    </w:tbl>
+    <w:p>
+      <w:r>
+        <w:t>※ ㅐ /ɛ/와 ㅔ /e/는 현대 화자(특히 젊은층)에서 [e̞]로 합류 추세.</w:t>
+      </w:r>
+    </w:p>
+    <w:p>
+      <w:pPr>
+        <w:pStyle w:val="Heading2"/>
+      </w:pPr>
+      <w:r>
+        <w:t>5.3 이중모음 (11개) — 보간으로 처리, 추가 타깃 불필요</w:t>
+      </w:r>
+    </w:p>
+    <w:p>
+      <w:r>
+        <w:t>이중모음은 활음(glide) + 모음의 부드러운 전이입니다. 새 타깃 없이 기존 단모음 타깃 간 보간으로 모두 실현. 코드에서 처리.</w:t>
+      </w:r>
+    </w:p>
+    <w:tbl>
+      <w:tblPr>
+        <w:tblStyle w:val="LightGrid-Accent1"/>
+        <w:tblW w:type="auto" w:w="0"/>
+        <w:tblLook w:firstColumn="1" w:firstRow="1" w:lastColumn="0" w:lastRow="0" w:noHBand="0" w:noVBand="1" w:val="04A0"/>
+      </w:tblPr>
+      <w:tblGrid>
+        <w:gridCol w:w="2160"/>
+        <w:gridCol w:w="2160"/>
+        <w:gridCol w:w="2160"/>
+        <w:gridCol w:w="2160"/>
+      </w:tblGrid>
+      <w:tr>
+        <w:tc>
+          <w:tcPr>
+            <w:tcW w:type="dxa" w:w="2160"/>
+          </w:tcPr>
+          <w:p>
+            <w:r>
+              <w:t>이중모음</w:t>
+            </w:r>
+          </w:p>
+        </w:tc>
+        <w:tc>
+          <w:tcPr>
+            <w:tcW w:type="dxa" w:w="2160"/>
+          </w:tcPr>
+          <w:p>
+            <w:r>
+              <w:t>IPA</w:t>
+            </w:r>
+          </w:p>
+        </w:tc>
+        <w:tc>
+          <w:tcPr>
+            <w:tcW w:type="dxa" w:w="2160"/>
+          </w:tcPr>
+          <w:p>
+            <w:r>
+              <w:t>활음</w:t>
+            </w:r>
+          </w:p>
+        </w:tc>
+        <w:tc>
+          <w:tcPr>
+            <w:tcW w:type="dxa" w:w="2160"/>
+          </w:tcPr>
+          <w:p>
+            <w:r>
+              <w:t>전이 패턴</w:t>
+            </w:r>
+          </w:p>
+        </w:tc>
+      </w:tr>
+      <w:tr>
+        <w:tc>
+          <w:tcPr>
+            <w:tcW w:type="dxa" w:w="2160"/>
+          </w:tcPr>
+          <w:p>
+            <w:r>
+              <w:t>ㅑ</w:t>
+            </w:r>
+          </w:p>
+        </w:tc>
+        <w:tc>
+          <w:tcPr>
+            <w:tcW w:type="dxa" w:w="2160"/>
+          </w:tcPr>
+          <w:p>
+            <w:r>
+              <w:t>/ja/</w:t>
+            </w:r>
+          </w:p>
+        </w:tc>
+        <w:tc>
+          <w:tcPr>
+            <w:tcW w:type="dxa" w:w="2160"/>
+          </w:tcPr>
+          <w:p>
+            <w:r>
+              <w:t>y-활음</w:t>
+            </w:r>
+          </w:p>
+        </w:tc>
+        <w:tc>
+          <w:tcPr>
+            <w:tcW w:type="dxa" w:w="2160"/>
+          </w:tcPr>
+          <w:p>
+            <w:r>
+              <w:t>ㅣ → ㅏ</w:t>
+            </w:r>
+          </w:p>
+        </w:tc>
+      </w:tr>
+      <w:tr>
+        <w:tc>
+          <w:tcPr>
+            <w:tcW w:type="dxa" w:w="2160"/>
+          </w:tcPr>
+          <w:p>
+            <w:r>
+              <w:t>ㅕ</w:t>
+            </w:r>
+          </w:p>
+        </w:tc>
+        <w:tc>
+          <w:tcPr>
+            <w:tcW w:type="dxa" w:w="2160"/>
+          </w:tcPr>
+          <w:p>
+            <w:r>
+              <w:t>/jʌ/</w:t>
+            </w:r>
+          </w:p>
+        </w:tc>
+        <w:tc>
+          <w:tcPr>
+            <w:tcW w:type="dxa" w:w="2160"/>
+          </w:tcPr>
+          <w:p>
+            <w:r>
+              <w:t>y-활음</w:t>
+            </w:r>
+          </w:p>
+        </w:tc>
+        <w:tc>
+          <w:tcPr>
+            <w:tcW w:type="dxa" w:w="2160"/>
+          </w:tcPr>
+          <w:p>
+            <w:r>
+              <w:t>ㅣ → ㅓ</w:t>
+            </w:r>
+          </w:p>
+        </w:tc>
+      </w:tr>
+      <w:tr>
+        <w:tc>
+          <w:tcPr>
+            <w:tcW w:type="dxa" w:w="2160"/>
+          </w:tcPr>
+          <w:p>
+            <w:r>
+              <w:t>ㅛ</w:t>
+            </w:r>
+          </w:p>
+        </w:tc>
+        <w:tc>
+          <w:tcPr>
+            <w:tcW w:type="dxa" w:w="2160"/>
+          </w:tcPr>
+          <w:p>
+            <w:r>
+              <w:t>/jo/</w:t>
+            </w:r>
+          </w:p>
+        </w:tc>
+        <w:tc>
+          <w:tcPr>
+            <w:tcW w:type="dxa" w:w="2160"/>
+          </w:tcPr>
+          <w:p>
+            <w:r>
+              <w:t>y-활음</w:t>
+            </w:r>
+          </w:p>
+        </w:tc>
+        <w:tc>
+          <w:tcPr>
+            <w:tcW w:type="dxa" w:w="2160"/>
+          </w:tcPr>
+          <w:p>
+            <w:r>
+              <w:t>ㅣ → ㅗ</w:t>
+            </w:r>
+          </w:p>
+        </w:tc>
+      </w:tr>
+      <w:tr>
+        <w:tc>
+          <w:tcPr>
+            <w:tcW w:type="dxa" w:w="2160"/>
+          </w:tcPr>
+          <w:p>
+            <w:r>
+              <w:t>ㅠ</w:t>
+            </w:r>
+          </w:p>
+        </w:tc>
+        <w:tc>
+          <w:tcPr>
+            <w:tcW w:type="dxa" w:w="2160"/>
+          </w:tcPr>
+          <w:p>
+            <w:r>
+              <w:t>/ju/</w:t>
+            </w:r>
+          </w:p>
+        </w:tc>
+        <w:tc>
+          <w:tcPr>
+            <w:tcW w:type="dxa" w:w="2160"/>
+          </w:tcPr>
+          <w:p>
+            <w:r>
+              <w:t>y-활음</w:t>
+            </w:r>
+          </w:p>
+        </w:tc>
+        <w:tc>
+          <w:tcPr>
+            <w:tcW w:type="dxa" w:w="2160"/>
+          </w:tcPr>
+          <w:p>
+            <w:r>
+              <w:t>ㅣ → ㅜ</w:t>
+            </w:r>
+          </w:p>
+        </w:tc>
+      </w:tr>
+      <w:tr>
+        <w:tc>
+          <w:tcPr>
+            <w:tcW w:type="dxa" w:w="2160"/>
+          </w:tcPr>
+          <w:p>
+            <w:r>
+              <w:t>ㅒ</w:t>
+            </w:r>
+          </w:p>
+        </w:tc>
+        <w:tc>
+          <w:tcPr>
+            <w:tcW w:type="dxa" w:w="2160"/>
+          </w:tcPr>
+          <w:p>
+            <w:r>
+              <w:t>/jɛ/</w:t>
+            </w:r>
+          </w:p>
+        </w:tc>
+        <w:tc>
+          <w:tcPr>
+            <w:tcW w:type="dxa" w:w="2160"/>
+          </w:tcPr>
+          <w:p>
+            <w:r>
+              <w:t>y-활음</w:t>
+            </w:r>
+          </w:p>
+        </w:tc>
+        <w:tc>
+          <w:tcPr>
+            <w:tcW w:type="dxa" w:w="2160"/>
+          </w:tcPr>
+          <w:p>
+            <w:r>
+              <w:t>ㅣ → ㅐ</w:t>
+            </w:r>
+          </w:p>
+        </w:tc>
+      </w:tr>
+      <w:tr>
+        <w:tc>
+          <w:tcPr>
+            <w:tcW w:type="dxa" w:w="2160"/>
+          </w:tcPr>
+          <w:p>
+            <w:r>
+              <w:t>ㅖ</w:t>
+            </w:r>
+          </w:p>
+        </w:tc>
+        <w:tc>
+          <w:tcPr>
+            <w:tcW w:type="dxa" w:w="2160"/>
+          </w:tcPr>
+          <w:p>
+            <w:r>
+              <w:t>/je/</w:t>
+            </w:r>
+          </w:p>
+        </w:tc>
+        <w:tc>
+          <w:tcPr>
+            <w:tcW w:type="dxa" w:w="2160"/>
+          </w:tcPr>
+          <w:p>
+            <w:r>
+              <w:t>y-활음</w:t>
+            </w:r>
+          </w:p>
+        </w:tc>
+        <w:tc>
+          <w:tcPr>
+            <w:tcW w:type="dxa" w:w="2160"/>
+          </w:tcPr>
+          <w:p>
+            <w:r>
+              <w:t>ㅣ → ㅔ</w:t>
+            </w:r>
+          </w:p>
+        </w:tc>
+      </w:tr>
+      <w:tr>
+        <w:tc>
+          <w:tcPr>
+            <w:tcW w:type="dxa" w:w="2160"/>
+          </w:tcPr>
+          <w:p>
+            <w:r>
+              <w:t>ㅘ</w:t>
+            </w:r>
+          </w:p>
+        </w:tc>
+        <w:tc>
+          <w:tcPr>
+            <w:tcW w:type="dxa" w:w="2160"/>
+          </w:tcPr>
+          <w:p>
+            <w:r>
+              <w:t>/wa/</w:t>
+            </w:r>
+          </w:p>
+        </w:tc>
+        <w:tc>
+          <w:tcPr>
+            <w:tcW w:type="dxa" w:w="2160"/>
+          </w:tcPr>
+          <w:p>
+            <w:r>
+              <w:t>w-활음</w:t>
+            </w:r>
+          </w:p>
+        </w:tc>
+        <w:tc>
+          <w:tcPr>
+            <w:tcW w:type="dxa" w:w="2160"/>
+          </w:tcPr>
+          <w:p>
+            <w:r>
+              <w:t>ㅜ → ㅏ</w:t>
+            </w:r>
+          </w:p>
+        </w:tc>
+      </w:tr>
+      <w:tr>
+        <w:tc>
+          <w:tcPr>
+            <w:tcW w:type="dxa" w:w="2160"/>
+          </w:tcPr>
+          <w:p>
+            <w:r>
+              <w:t>ㅝ</w:t>
+            </w:r>
+          </w:p>
+        </w:tc>
+        <w:tc>
+          <w:tcPr>
+            <w:tcW w:type="dxa" w:w="2160"/>
+          </w:tcPr>
+          <w:p>
+            <w:r>
+              <w:t>/wʌ/</w:t>
+            </w:r>
+          </w:p>
+        </w:tc>
+        <w:tc>
+          <w:tcPr>
+            <w:tcW w:type="dxa" w:w="2160"/>
+          </w:tcPr>
+          <w:p>
+            <w:r>
+              <w:t>w-활음</w:t>
+            </w:r>
+          </w:p>
+        </w:tc>
+        <w:tc>
+          <w:tcPr>
+            <w:tcW w:type="dxa" w:w="2160"/>
+          </w:tcPr>
+          <w:p>
+            <w:r>
+              <w:t>ㅜ → ㅓ</w:t>
+            </w:r>
+          </w:p>
+        </w:tc>
+      </w:tr>
+      <w:tr>
+        <w:tc>
+          <w:tcPr>
+            <w:tcW w:type="dxa" w:w="2160"/>
+          </w:tcPr>
+          <w:p>
+            <w:r>
+              <w:t>ㅙ</w:t>
+            </w:r>
+          </w:p>
+        </w:tc>
+        <w:tc>
+          <w:tcPr>
+            <w:tcW w:type="dxa" w:w="2160"/>
+          </w:tcPr>
+          <w:p>
+            <w:r>
+              <w:t>/wɛ/</w:t>
+            </w:r>
+          </w:p>
+        </w:tc>
+        <w:tc>
+          <w:tcPr>
+            <w:tcW w:type="dxa" w:w="2160"/>
+          </w:tcPr>
+          <w:p>
+            <w:r>
+              <w:t>w-활음</w:t>
+            </w:r>
+          </w:p>
+        </w:tc>
+        <w:tc>
+          <w:tcPr>
+            <w:tcW w:type="dxa" w:w="2160"/>
+          </w:tcPr>
+          <w:p>
+            <w:r>
+              <w:t>ㅜ → ㅐ</w:t>
+            </w:r>
+          </w:p>
+        </w:tc>
+      </w:tr>
+      <w:tr>
+        <w:tc>
+          <w:tcPr>
+            <w:tcW w:type="dxa" w:w="2160"/>
+          </w:tcPr>
+          <w:p>
+            <w:r>
+              <w:t>ㅞ</w:t>
+            </w:r>
+          </w:p>
+        </w:tc>
+        <w:tc>
+          <w:tcPr>
+            <w:tcW w:type="dxa" w:w="2160"/>
+          </w:tcPr>
+          <w:p>
+            <w:r>
+              <w:t>/we/</w:t>
+            </w:r>
+          </w:p>
+        </w:tc>
+        <w:tc>
+          <w:tcPr>
+            <w:tcW w:type="dxa" w:w="2160"/>
+          </w:tcPr>
+          <w:p>
+            <w:r>
+              <w:t>w-활음</w:t>
+            </w:r>
+          </w:p>
+        </w:tc>
+        <w:tc>
+          <w:tcPr>
+            <w:tcW w:type="dxa" w:w="2160"/>
+          </w:tcPr>
+          <w:p>
+            <w:r>
+              <w:t>ㅜ → ㅔ</w:t>
+            </w:r>
+          </w:p>
+        </w:tc>
+      </w:tr>
+      <w:tr>
+        <w:tc>
+          <w:tcPr>
+            <w:tcW w:type="dxa" w:w="2160"/>
+          </w:tcPr>
+          <w:p>
+            <w:r>
+              <w:t>ㅢ</w:t>
+            </w:r>
+          </w:p>
+        </w:tc>
+        <w:tc>
+          <w:tcPr>
+            <w:tcW w:type="dxa" w:w="2160"/>
+          </w:tcPr>
+          <w:p>
+            <w:r>
+              <w:t>/ɰi/</w:t>
+            </w:r>
+          </w:p>
+        </w:tc>
+        <w:tc>
+          <w:tcPr>
+            <w:tcW w:type="dxa" w:w="2160"/>
+          </w:tcPr>
+          <w:p>
+            <w:r>
+              <w:t>ɰ-활음</w:t>
+            </w:r>
+          </w:p>
+        </w:tc>
+        <w:tc>
+          <w:tcPr>
+            <w:tcW w:type="dxa" w:w="2160"/>
+          </w:tcPr>
+          <w:p>
+            <w:r>
+              <w:t>ㅡ → ㅣ</w:t>
             </w:r>
           </w:p>
         </w:tc>
@@ -1096,10 +2856,15 @@
     </w:tbl>
     <w:p>
       <w:pPr>
-        <w:pStyle w:val="Heading2"/>
+        <w:pStyle w:val="Heading1"/>
       </w:pPr>
       <w:r>
-        <w:t>모음 (단모음)</w:t>
+        <w:t>6. 공기 흐름(Airflow) 출구 마커 — (선택)</w:t>
+      </w:r>
+    </w:p>
+    <w:p>
+      <w:r>
+        <w:t>웹 앱에서 음소별로 공기 입자가 어디로 나가는지 시각화합니다. 다음 위치에 빈 노드(empty / locator)가 모델에 포함되면 코드에서 자동 인식. 어려우시면 좌표만 별도 문서로 알려주셔도 됩니다.</w:t>
       </w:r>
     </w:p>
     <w:tbl>
@@ -1120,7 +2885,7 @@
           </w:tcPr>
           <w:p>
             <w:r>
-              <w:t>모음</w:t>
+              <w:t>마커 이름</w:t>
             </w:r>
           </w:p>
         </w:tc>
@@ -1130,7 +2895,7 @@
           </w:tcPr>
           <w:p>
             <w:r>
-              <w:t>혀높이/위치/원순</w:t>
+              <w:t>위치</w:t>
             </w:r>
           </w:p>
         </w:tc>
@@ -1140,7 +2905,7 @@
           </w:tcPr>
           <w:p>
             <w:r>
-              <w:t>주요 타깃(가중치)</w:t>
+              <w:t>활용 음소</w:t>
             </w:r>
           </w:p>
         </w:tc>
@@ -1152,7 +2917,7 @@
           </w:tcPr>
           <w:p>
             <w:r>
-              <w:t>ㅏ</w:t>
+              <w:t>airflow_oral_central</w:t>
             </w:r>
           </w:p>
         </w:tc>
@@ -1162,7 +2927,7 @@
           </w:tcPr>
           <w:p>
             <w:r>
-              <w:t>저·후, 평순</w:t>
+              <w:t>혀 중앙 홈 출구(앞날과 치경 사이)</w:t>
             </w:r>
           </w:p>
         </w:tc>
@@ -1172,7 +2937,7 @@
           </w:tcPr>
           <w:p>
             <w:r>
-              <w:t>jaw_open(0.8)</w:t>
+              <w:t>ㅅ ㅆ ㅈ ㅊ ㅉ</w:t>
             </w:r>
           </w:p>
         </w:tc>
@@ -1184,7 +2949,7 @@
           </w:tcPr>
           <w:p>
             <w:r>
-              <w:t>ㅓ</w:t>
+              <w:t>airflow_oral_left</w:t>
             </w:r>
           </w:p>
         </w:tc>
@@ -1194,7 +2959,7 @@
           </w:tcPr>
           <w:p>
             <w:r>
-              <w:t>중·후, 평순</w:t>
+              <w:t>혀 왼쪽 측면 출구(어금니 옆)</w:t>
             </w:r>
           </w:p>
         </w:tc>
@@ -1204,7 +2969,7 @@
           </w:tcPr>
           <w:p>
             <w:r>
-              <w:t>jaw_open(0.5)</w:t>
+              <w:t>ㄹ (설측)</w:t>
             </w:r>
           </w:p>
         </w:tc>
@@ -1216,7 +2981,7 @@
           </w:tcPr>
           <w:p>
             <w:r>
-              <w:t>ㅗ</w:t>
+              <w:t>airflow_oral_right</w:t>
             </w:r>
           </w:p>
         </w:tc>
@@ -1226,7 +2991,7 @@
           </w:tcPr>
           <w:p>
             <w:r>
-              <w:t>중·후, 원순</w:t>
+              <w:t>혀 오른쪽 측면 출구(어금니 옆)</w:t>
             </w:r>
           </w:p>
         </w:tc>
@@ -1236,7 +3001,7 @@
           </w:tcPr>
           <w:p>
             <w:r>
-              <w:t>jaw_open(0.4) + lips_round(0.7) + tongue_back_up(0.3)</w:t>
+              <w:t>ㄹ (설측)</w:t>
             </w:r>
           </w:p>
         </w:tc>
@@ -1248,7 +3013,7 @@
           </w:tcPr>
           <w:p>
             <w:r>
-              <w:t>ㅜ</w:t>
+              <w:t>airflow_labial</w:t>
             </w:r>
           </w:p>
         </w:tc>
@@ -1258,7 +3023,7 @@
           </w:tcPr>
           <w:p>
             <w:r>
-              <w:t>고·후, 원순</w:t>
+              <w:t>입술 사이 정중앙</w:t>
             </w:r>
           </w:p>
         </w:tc>
@@ -1268,7 +3033,7 @@
           </w:tcPr>
           <w:p>
             <w:r>
-              <w:t>lips_round(1) + tongue_back_up(0.6)</w:t>
+              <w:t>ㅂ ㅍ 개방 시 모든 모음</w:t>
             </w:r>
           </w:p>
         </w:tc>
@@ -1280,7 +3045,7 @@
           </w:tcPr>
           <w:p>
             <w:r>
-              <w:t>ㅡ</w:t>
+              <w:t>airflow_nasal_l</w:t>
             </w:r>
           </w:p>
         </w:tc>
@@ -1290,7 +3055,7 @@
           </w:tcPr>
           <w:p>
             <w:r>
-              <w:t>고·후, 평순</w:t>
+              <w:t>왼쪽 콧구멍</w:t>
             </w:r>
           </w:p>
         </w:tc>
@@ -1300,7 +3065,7 @@
           </w:tcPr>
           <w:p>
             <w:r>
-              <w:t>tongue_back_up(0.5)</w:t>
+              <w:t>ㅁ ㄴ ㅇ</w:t>
             </w:r>
           </w:p>
         </w:tc>
@@ -1312,7 +3077,7 @@
           </w:tcPr>
           <w:p>
             <w:r>
-              <w:t>ㅣ</w:t>
+              <w:t>airflow_nasal_r</w:t>
             </w:r>
           </w:p>
         </w:tc>
@@ -1322,7 +3087,7 @@
           </w:tcPr>
           <w:p>
             <w:r>
-              <w:t>고·전, 평순</w:t>
+              <w:t>오른쪽 콧구멍</w:t>
             </w:r>
           </w:p>
         </w:tc>
@@ -1332,39 +3097,7 @@
           </w:tcPr>
           <w:p>
             <w:r>
-              <w:t>tongue_front_up(0.8) + lips_spread(0.6)</w:t>
-            </w:r>
-          </w:p>
-        </w:tc>
-      </w:tr>
-      <w:tr>
-        <w:tc>
-          <w:tcPr>
-            <w:tcW w:type="dxa" w:w="2880"/>
-          </w:tcPr>
-          <w:p>
-            <w:r>
-              <w:t>ㅔ·ㅐ</w:t>
-            </w:r>
-          </w:p>
-        </w:tc>
-        <w:tc>
-          <w:tcPr>
-            <w:tcW w:type="dxa" w:w="2880"/>
-          </w:tcPr>
-          <w:p>
-            <w:r>
-              <w:t>중·전, 평순</w:t>
-            </w:r>
-          </w:p>
-        </w:tc>
-        <w:tc>
-          <w:tcPr>
-            <w:tcW w:type="dxa" w:w="2880"/>
-          </w:tcPr>
-          <w:p>
-            <w:r>
-              <w:t>tongue_front_up(0.4) + lips_spread(0.3) + jaw_open(0.3)</w:t>
+              <w:t>ㅁ ㄴ ㅇ</w:t>
             </w:r>
           </w:p>
         </w:tc>
@@ -1375,7 +3108,7 @@
         <w:pStyle w:val="Heading1"/>
       </w:pPr>
       <w:r>
-        <w:t>6. 검수 체크리스트 (납품 전 확인)</w:t>
+        <w:t>7. 검수 체크리스트 (납품 전 확인)</w:t>
       </w:r>
     </w:p>
     <w:p>
@@ -1383,7 +3116,7 @@
         <w:pStyle w:val="ListBullet"/>
       </w:pPr>
       <w:r>
-        <w:t>glb 단독으로 열었을 때(예: gltf-viewer.donmccurdy.com) 각 타깃 0→1 시 의도대로 변형되는가.</w:t>
+        <w:t>glb 단독으로 열어 각 타깃 0→1 시 의도대로 변형되는가.</w:t>
       </w:r>
     </w:p>
     <w:p>
@@ -1415,7 +3148,23 @@
         <w:pStyle w:val="ListBullet"/>
       </w:pPr>
       <w:r>
-        <w:t>tongue_tip_up / tongue_back_up 접촉 지점이 해부학적으로 맞는가(치경 vs 연구개).</w:t>
+        <w:t>tongue_tip_up / tongue_back_up / tongue_front_up 접촉 지점이 해부학적으로 맞는가.</w:t>
+      </w:r>
+    </w:p>
+    <w:p>
+      <w:pPr>
+        <w:pStyle w:val="ListBullet"/>
+      </w:pPr>
+      <w:r>
+        <w:t>tongue_groove가 위·정면 시점에서 명확한 중앙 세로 홈으로 보이는가.</w:t>
+      </w:r>
+    </w:p>
+    <w:p>
+      <w:pPr>
+        <w:pStyle w:val="ListBullet"/>
+      </w:pPr>
+      <w:r>
+        <w:t>tongue_lateral_channel이 정면 시점에서 양옆 채널 + 중앙 함몰로 보이는가.</w:t>
       </w:r>
     </w:p>
     <w:p>
@@ -1439,6 +3188,14 @@
         <w:pStyle w:val="ListBullet"/>
       </w:pPr>
       <w:r>
+        <w:t>풀 3D로 회전했을 때 전·후·상·하 시점에서 메시 결손이 없는가.</w:t>
+      </w:r>
+    </w:p>
+    <w:p>
+      <w:pPr>
+        <w:pStyle w:val="ListBullet"/>
+      </w:pPr>
+      <w:r>
         <w:t>정면 축·스케일이 문서에 명시되어 있는가.</w:t>
       </w:r>
     </w:p>
@@ -1447,7 +3204,7 @@
         <w:pStyle w:val="Heading1"/>
       </w:pPr>
       <w:r>
-        <w:t>7. 웹 연동 (참고)</w:t>
+        <w:t>8. 웹 연동 (참고)</w:t>
       </w:r>
     </w:p>
     <w:p>
@@ -1455,7 +3212,7 @@
         <w:pStyle w:val="ListBullet"/>
       </w:pPr>
       <w:r>
-        <w:t>three.js / R3F에서 gltf.scene 로드 후 — 블렌드셰이프: mesh.morphTargetInfluences[i]=0..1, 본: getObjectByName(name).rotation/position.</w:t>
+        <w:t>three.js / R3F에서 gltf.scene 로드 후 — 블렌드셰이프: mesh.morphTargetInfluences[i]=0..1, 빈 노드: getObjectByName(name) 위치 추출.</w:t>
       </w:r>
     </w:p>
     <w:p>
@@ -1463,7 +3220,7 @@
         <w:pStyle w:val="ListBullet"/>
       </w:pPr>
       <w:r>
-        <w:t>위 타깃 이름을 그대로 코드에서 호출하므로 철자/대소문자를 정확히 맞춰 주세요.</w:t>
+        <w:t>위 타깃·마커 이름을 그대로 코드에서 호출하므로 철자/대소문자를 정확히 맞춰 주세요.</w:t>
       </w:r>
     </w:p>
     <w:p>
@@ -1476,7 +3233,7 @@
     </w:p>
     <w:p>
       <w:r>
-        <w:t>문의: 타깃 이름·매핑·축 규약은 조정 가능. 우선 위 이름 그대로 만들어 주시면 그대로 연결됩니다.</w:t>
+        <w:t>변경 이력 — v2 (2026-05): 풀 3D 모델 요구, tongue_lateral_channel 추가, 한국어 자음 19개·모음 21개(단모음 10 + 이중모음 11) 전체 매핑, 공기 흐름 마커 섹션 추가. v1: 사지철 단면 + 11개 타깃 초안.</w:t>
       </w:r>
     </w:p>
     <w:sectPr>

</xml_diff>

<commit_message>
docs: bump RIGGING_SPEC to v2.1 — clarify contact vs constriction
음성학적 정확성 정정.
- §5.0 조음 원리 섹션 신설: tongue_tip_up 가중치 의미를
  접촉(1.0) / 좁힘(0.7~0.85, 닿지 않음·난기류) / 개방(0~0.3)으로 명시
- 마찰음 ㅅ(0.75) ㅆ(0.82): 닿지 않는 좁힘에서 난기류 발생 (지속음)
- 설측음 ㄹ: tongue_tip_up 0.9 → 1.0 (접촉 유지), 양옆으로 기류
- 탄설음 ㄹ: 1.0 (순간 접촉)
- 공기 흐름 마커 섹션에 음소별 흐름 경로 설명 추가
</commit_message>
<xml_diff>
--- a/docs/RIGGING_SPEC.docx
+++ b/docs/RIGGING_SPEC.docx
@@ -7,7 +7,7 @@
         <w:pStyle w:val="Title"/>
       </w:pPr>
       <w:r>
-        <w:t>조음기관 3D 리깅 사양서 v2 (Articulator Rig Spec v2)</w:t>
+        <w:t>조음기관 3D 리깅 사양서 v2.1 (Articulator Rig Spec v2.1)</w:t>
       </w:r>
     </w:p>
     <w:p>
@@ -933,6 +933,164 @@
         <w:pStyle w:val="Heading2"/>
       </w:pPr>
       <w:r>
+        <w:t>5.0 조음 원리 — 접촉 vs 좁힘 vs 개방 (중요)</w:t>
+      </w:r>
+    </w:p>
+    <w:p>
+      <w:r>
+        <w:t>같은 tongue_tip_up 블렌드셰이프라도 가중치에 따라 조음 방법이 달라집니다. 리거는 0~1 가산이 자연스럽게 이어지도록만 만들어 주시면, 음운 차이는 코드에서 가중치로 표현합니다.</w:t>
+      </w:r>
+    </w:p>
+    <w:tbl>
+      <w:tblPr>
+        <w:tblStyle w:val="LightGrid-Accent1"/>
+        <w:tblW w:type="auto" w:w="0"/>
+        <w:tblLook w:firstColumn="1" w:firstRow="1" w:lastColumn="0" w:lastRow="0" w:noHBand="0" w:noVBand="1" w:val="04A0"/>
+      </w:tblPr>
+      <w:tblGrid>
+        <w:gridCol w:w="2880"/>
+        <w:gridCol w:w="2880"/>
+        <w:gridCol w:w="2880"/>
+      </w:tblGrid>
+      <w:tr>
+        <w:tc>
+          <w:tcPr>
+            <w:tcW w:type="dxa" w:w="2880"/>
+          </w:tcPr>
+          <w:p>
+            <w:r>
+              <w:t>가중치 범위</w:t>
+            </w:r>
+          </w:p>
+        </w:tc>
+        <w:tc>
+          <w:tcPr>
+            <w:tcW w:type="dxa" w:w="2880"/>
+          </w:tcPr>
+          <w:p>
+            <w:r>
+              <w:t>조음 상태</w:t>
+            </w:r>
+          </w:p>
+        </w:tc>
+        <w:tc>
+          <w:tcPr>
+            <w:tcW w:type="dxa" w:w="2880"/>
+          </w:tcPr>
+          <w:p>
+            <w:r>
+              <w:t>해당 음소 유형</w:t>
+            </w:r>
+          </w:p>
+        </w:tc>
+      </w:tr>
+      <w:tr>
+        <w:tc>
+          <w:tcPr>
+            <w:tcW w:type="dxa" w:w="2880"/>
+          </w:tcPr>
+          <w:p>
+            <w:r>
+              <w:t>= 1.0</w:t>
+            </w:r>
+          </w:p>
+        </w:tc>
+        <w:tc>
+          <w:tcPr>
+            <w:tcW w:type="dxa" w:w="2880"/>
+          </w:tcPr>
+          <w:p>
+            <w:r>
+              <w:t>완전 접촉 (혀가 치조에 닿아 폐쇄/유지)</w:t>
+            </w:r>
+          </w:p>
+        </w:tc>
+        <w:tc>
+          <w:tcPr>
+            <w:tcW w:type="dxa" w:w="2880"/>
+          </w:tcPr>
+          <w:p>
+            <w:r>
+              <w:t>파열음 ㄷ ㅌ ㄸ, 비음 ㄴ, 설측음 ㄹ, 탄설음 ㄹ</w:t>
+            </w:r>
+          </w:p>
+        </w:tc>
+      </w:tr>
+      <w:tr>
+        <w:tc>
+          <w:tcPr>
+            <w:tcW w:type="dxa" w:w="2880"/>
+          </w:tcPr>
+          <w:p>
+            <w:r>
+              <w:t>0.7 ~ 0.85</w:t>
+            </w:r>
+          </w:p>
+        </w:tc>
+        <w:tc>
+          <w:tcPr>
+            <w:tcW w:type="dxa" w:w="2880"/>
+          </w:tcPr>
+          <w:p>
+            <w:r>
+              <w:t>좁힘 형성 (혀가 치조 근처로 올라가되 닿지 않고 좁은 간격 유지 → 난기류)</w:t>
+            </w:r>
+          </w:p>
+        </w:tc>
+        <w:tc>
+          <w:tcPr>
+            <w:tcW w:type="dxa" w:w="2880"/>
+          </w:tcPr>
+          <w:p>
+            <w:r>
+              <w:t>마찰음 ㅅ ㅆ</w:t>
+            </w:r>
+          </w:p>
+        </w:tc>
+      </w:tr>
+      <w:tr>
+        <w:tc>
+          <w:tcPr>
+            <w:tcW w:type="dxa" w:w="2880"/>
+          </w:tcPr>
+          <w:p>
+            <w:r>
+              <w:t>0 ~ 0.3</w:t>
+            </w:r>
+          </w:p>
+        </w:tc>
+        <w:tc>
+          <w:tcPr>
+            <w:tcW w:type="dxa" w:w="2880"/>
+          </w:tcPr>
+          <w:p>
+            <w:r>
+              <w:t>거의 중립 (개방)</w:t>
+            </w:r>
+          </w:p>
+        </w:tc>
+        <w:tc>
+          <w:tcPr>
+            <w:tcW w:type="dxa" w:w="2880"/>
+          </w:tcPr>
+          <w:p>
+            <w:r>
+              <w:t>모음, 후음 ㅎ</w:t>
+            </w:r>
+          </w:p>
+        </w:tc>
+      </w:tr>
+    </w:tbl>
+    <w:p>
+      <w:r>
+        <w:t>마찬가지로: tongue_back_up = 1.0 → 완전 접촉 (파열음 ㄱ ㅋ ㄲ, 비음 ㅇ) / 0.3~0.6 → 좁힘 없는 거상 (후설 모음). lips_closed = 1.0 → 완전 폐쇄 / 0.0 → 개방.</w:t>
+      </w:r>
+    </w:p>
+    <w:p>
+      <w:pPr>
+        <w:pStyle w:val="Heading2"/>
+      </w:pPr>
+      <w:r>
         <w:t>5.1 자음 (19개)</w:t>
       </w:r>
     </w:p>
@@ -1363,7 +1521,7 @@
           </w:tcPr>
           <w:p>
             <w:r>
-              <w:t>tongue_tip_up(0.6) + tongue_groove(1) + jaw_open(0.3)</w:t>
+              <w:t>tongue_tip_up(0.75 — 닿지 않음, 좁힘만) + tongue_groove(1) + jaw_open(0.3)</w:t>
             </w:r>
           </w:p>
         </w:tc>
@@ -1405,7 +1563,7 @@
           </w:tcPr>
           <w:p>
             <w:r>
-              <w:t>tongue_tip_up(0.7) + tongue_groove(1) + jaw_open(0.3)</w:t>
+              <w:t>tongue_tip_up(0.82 — 더 좁은 틈, 닿지 않음) + tongue_groove(1) + jaw_open(0.3)</w:t>
             </w:r>
           </w:p>
         </w:tc>
@@ -1741,7 +1899,7 @@
           </w:tcPr>
           <w:p>
             <w:r>
-              <w:t>tongue_tip_up(1) [짧게 반복]</w:t>
+              <w:t>tongue_tip_up(1.0 — 순간 접촉) [짧게 반복]</w:t>
             </w:r>
           </w:p>
         </w:tc>
@@ -1783,7 +1941,7 @@
           </w:tcPr>
           <w:p>
             <w:r>
-              <w:t>tongue_tip_up(0.9) + tongue_lateral_channel(1)</w:t>
+              <w:t>tongue_tip_up(1.0 — 접촉 유지) + tongue_lateral_channel(1)</w:t>
             </w:r>
           </w:p>
         </w:tc>
@@ -2867,6 +3025,11 @@
         <w:t>웹 앱에서 음소별로 공기 입자가 어디로 나가는지 시각화합니다. 다음 위치에 빈 노드(empty / locator)가 모델에 포함되면 코드에서 자동 인식. 어려우시면 좌표만 별도 문서로 알려주셔도 됩니다.</w:t>
       </w:r>
     </w:p>
+    <w:p>
+      <w:r>
+        <w:t>개념: 아래 마커는 공기가 최종적으로 나오는 출구입니다. 마찰음 ㅅ ㅆ는 좁힘 부위에서 난기류 발생 → 앞쪽으로 지속 배출 (airflow_oral_central / airflow_labial). 설측음 ㄹ는 혀끝 접촉 유지 + 양옆으로 흐름 (airflow_oral_left/right). 파열음은 폐쇄→개방 시 분출 (airflow_labial). 비음은 비강 경로 (airflow_nasal_l/r).</w:t>
+      </w:r>
+    </w:p>
     <w:tbl>
       <w:tblPr>
         <w:tblStyle w:val="LightGrid-Accent1"/>
@@ -3233,7 +3396,7 @@
     </w:p>
     <w:p>
       <w:r>
-        <w:t>변경 이력 — v2 (2026-05): 풀 3D 모델 요구, tongue_lateral_channel 추가, 한국어 자음 19개·모음 21개(단모음 10 + 이중모음 11) 전체 매핑, 공기 흐름 마커 섹션 추가. v1: 사지철 단면 + 11개 타깃 초안.</w:t>
+        <w:t>변경 이력 — v2.1 (2026-05): 조음 원리 섹션 추가 (tongue_tip_up 가중치 의미 — 1.0 접촉 / 0.7~0.85 좁힘(닿지 않음) / 0~0.3 개방). 마찰음 ㅅ ㅆ는 닿지 않는 좁힘(난기류), 설측음 ㄹ는 접촉 유지 + 양옆 기류로 정정. 공기 흐름 마커에 음소별 흐름 설명 추가. v2: 풀 3D 모델, tongue_lateral_channel 추가, 한국어 음운 전체 매핑. v1: 사지철 단면 + 11개 타깃 초안.</w:t>
       </w:r>
     </w:p>
     <w:sectPr>

</xml_diff>

<commit_message>
docs: bump RIGGING_SPEC to v2.2 — comprehensive phonetic review
모든 음소 음성학적 재검증.
- ㅇ(받침): tongue_back_up 0.9 → 1.0 (완전 접촉)
- ㅈ ㅊ ㅉ 파찰음: 폐쇄(1.0) + 개방(groove 0.5) 2단계 명시
- ㅗ: 가중치 미세조정 (jaw 0.4→0.3, back_up 0.3→0.4)
- ㅡ: 입술 중립 명시 (ㅜ와의 핵심 차이)
- ㅎ: 동시조음(다음 모음 형태 따름) 명시
- 신설 §5.4: 음성학적 미세 변형(allophones) — 받침 미파열, ㅅ+ㅣ
  구개음화, ㅎ 동시조음, ㄴ/ㄹ + ㅣ 등 환경별 변형 가중치 정리
- 신설 §5.5: 평음/격음/경음 VOT·성문 긴장도 차이 (조음 형태는 동일)
</commit_message>
<xml_diff>
--- a/docs/RIGGING_SPEC.docx
+++ b/docs/RIGGING_SPEC.docx
@@ -7,7 +7,7 @@
         <w:pStyle w:val="Title"/>
       </w:pPr>
       <w:r>
-        <w:t>조음기관 3D 리깅 사양서 v2.1 (Articulator Rig Spec v2.1)</w:t>
+        <w:t>조음기관 3D 리깅 사양서 v2.2 (Articulator Rig Spec v2.2)</w:t>
       </w:r>
     </w:p>
     <w:p>
@@ -1605,7 +1605,7 @@
           </w:tcPr>
           <w:p>
             <w:r>
-              <w:t>tongue_front_up(1) + tongue_groove(0.5)</w:t>
+              <w:t>tongue_front_up(1, 폐쇄 시점) + tongue_groove(0.5, 개방 시)</w:t>
             </w:r>
           </w:p>
         </w:tc>
@@ -1647,7 +1647,7 @@
           </w:tcPr>
           <w:p>
             <w:r>
-              <w:t>tongue_front_up(1) + tongue_groove(0.5)</w:t>
+              <w:t>tongue_front_up(1, 폐쇄 시점) + tongue_groove(0.5, 개방 시)</w:t>
             </w:r>
           </w:p>
         </w:tc>
@@ -1689,7 +1689,7 @@
           </w:tcPr>
           <w:p>
             <w:r>
-              <w:t>tongue_front_up(1) + tongue_groove(0.5)</w:t>
+              <w:t>tongue_front_up(1, 폐쇄 시점) + tongue_groove(0.5, 개방 시)</w:t>
             </w:r>
           </w:p>
         </w:tc>
@@ -1857,7 +1857,7 @@
           </w:tcPr>
           <w:p>
             <w:r>
-              <w:t>tongue_back_up(0.9) + velum_open(1)</w:t>
+              <w:t>tongue_back_up(1.0, 완전 접촉) + velum_open(1)</w:t>
             </w:r>
           </w:p>
         </w:tc>
@@ -1983,7 +1983,7 @@
           </w:tcPr>
           <w:p>
             <w:r>
-              <w:t>jaw_open(0.3) (구강 변형 거의 없음)</w:t>
+              <w:t>jaw_open(0.3) — 다음 모음의 형태를 따름(동시조음)</w:t>
             </w:r>
           </w:p>
         </w:tc>
@@ -2177,7 +2177,7 @@
           </w:tcPr>
           <w:p>
             <w:r>
-              <w:t>jaw_open(0.4) + lips_round(0.7) + tongue_back_up(0.3)</w:t>
+              <w:t>jaw_open(0.3) + lips_round(0.7) + tongue_back_up(0.4)</w:t>
             </w:r>
           </w:p>
         </w:tc>
@@ -2261,7 +2261,7 @@
           </w:tcPr>
           <w:p>
             <w:r>
-              <w:t>tongue_back_up(0.5)</w:t>
+              <w:t>tongue_back_up(0.5), 입술 중립 (lips_round=lips_spread=0; ㅜ와 핵심 차이)</w:t>
             </w:r>
           </w:p>
         </w:tc>
@@ -3007,6 +3007,481 @@
           <w:p>
             <w:r>
               <w:t>ㅡ → ㅣ</w:t>
+            </w:r>
+          </w:p>
+        </w:tc>
+      </w:tr>
+    </w:tbl>
+    <w:p>
+      <w:pPr>
+        <w:pStyle w:val="Heading2"/>
+      </w:pPr>
+      <w:r>
+        <w:t>5.4 음성학적 미세 변형 / Allophones (참고)</w:t>
+      </w:r>
+    </w:p>
+    <w:p>
+      <w:r>
+        <w:t>다음은 같은 음소가 환경에 따라 다르게 실현되는 경우입니다. 새 블렌드셰이프는 필요 없고, 기존 타깃 가중치를 코드에서 환경별로 조정합니다.</w:t>
+      </w:r>
+    </w:p>
+    <w:tbl>
+      <w:tblPr>
+        <w:tblStyle w:val="LightGrid-Accent1"/>
+        <w:tblW w:type="auto" w:w="0"/>
+        <w:tblLook w:firstColumn="1" w:firstRow="1" w:lastColumn="0" w:lastRow="0" w:noHBand="0" w:noVBand="1" w:val="04A0"/>
+      </w:tblPr>
+      <w:tblGrid>
+        <w:gridCol w:w="2880"/>
+        <w:gridCol w:w="2880"/>
+        <w:gridCol w:w="2880"/>
+      </w:tblGrid>
+      <w:tr>
+        <w:tc>
+          <w:tcPr>
+            <w:tcW w:type="dxa" w:w="2880"/>
+          </w:tcPr>
+          <w:p>
+            <w:r>
+              <w:t>환경</w:t>
+            </w:r>
+          </w:p>
+        </w:tc>
+        <w:tc>
+          <w:tcPr>
+            <w:tcW w:type="dxa" w:w="2880"/>
+          </w:tcPr>
+          <w:p>
+            <w:r>
+              <w:t>변형</w:t>
+            </w:r>
+          </w:p>
+        </w:tc>
+        <w:tc>
+          <w:tcPr>
+            <w:tcW w:type="dxa" w:w="2880"/>
+          </w:tcPr>
+          <w:p>
+            <w:r>
+              <w:t>가중치 조정</w:t>
+            </w:r>
+          </w:p>
+        </w:tc>
+      </w:tr>
+      <w:tr>
+        <w:tc>
+          <w:tcPr>
+            <w:tcW w:type="dxa" w:w="2880"/>
+          </w:tcPr>
+          <w:p>
+            <w:r>
+              <w:t>받침 위치 폐쇄음(ㅂ/ㄷ/ㄱ)</w:t>
+            </w:r>
+          </w:p>
+        </w:tc>
+        <w:tc>
+          <w:tcPr>
+            <w:tcW w:type="dxa" w:w="2880"/>
+          </w:tcPr>
+          <w:p>
+            <w:r>
+              <w:t>미파열(unreleased) — 폐쇄만, 개방 없음</w:t>
+            </w:r>
+          </w:p>
+        </w:tc>
+        <w:tc>
+          <w:tcPr>
+            <w:tcW w:type="dxa" w:w="2880"/>
+          </w:tcPr>
+          <w:p>
+            <w:r>
+              <w:t>jaw_open 0 유지, release 단계 생략</w:t>
+            </w:r>
+          </w:p>
+        </w:tc>
+      </w:tr>
+      <w:tr>
+        <w:tc>
+          <w:tcPr>
+            <w:tcW w:type="dxa" w:w="2880"/>
+          </w:tcPr>
+          <w:p>
+            <w:r>
+              <w:t>ㅅ + ㅣ</w:t>
+            </w:r>
+          </w:p>
+        </w:tc>
+        <w:tc>
+          <w:tcPr>
+            <w:tcW w:type="dxa" w:w="2880"/>
+          </w:tcPr>
+          <w:p>
+            <w:r>
+              <w:t>/ɕ/로 구개음화</w:t>
+            </w:r>
+          </w:p>
+        </w:tc>
+        <w:tc>
+          <w:tcPr>
+            <w:tcW w:type="dxa" w:w="2880"/>
+          </w:tcPr>
+          <w:p>
+            <w:r>
+              <w:t>tongue_tip_up(0.55) + tongue_front_up(0.5) + tongue_groove(1)</w:t>
+            </w:r>
+          </w:p>
+        </w:tc>
+      </w:tr>
+      <w:tr>
+        <w:tc>
+          <w:tcPr>
+            <w:tcW w:type="dxa" w:w="2880"/>
+          </w:tcPr>
+          <w:p>
+            <w:r>
+              <w:t>ㅈ ㅊ ㅉ + ㅣ</w:t>
+            </w:r>
+          </w:p>
+        </w:tc>
+        <w:tc>
+          <w:tcPr>
+            <w:tcW w:type="dxa" w:w="2880"/>
+          </w:tcPr>
+          <w:p>
+            <w:r>
+              <w:t>더 깊은 구개음화</w:t>
+            </w:r>
+          </w:p>
+        </w:tc>
+        <w:tc>
+          <w:tcPr>
+            <w:tcW w:type="dxa" w:w="2880"/>
+          </w:tcPr>
+          <w:p>
+            <w:r>
+              <w:t>tongue_front_up(1) 유지 + 자연 전이</w:t>
+            </w:r>
+          </w:p>
+        </w:tc>
+      </w:tr>
+      <w:tr>
+        <w:tc>
+          <w:tcPr>
+            <w:tcW w:type="dxa" w:w="2880"/>
+          </w:tcPr>
+          <w:p>
+            <w:r>
+              <w:t>ㅎ + 모음</w:t>
+            </w:r>
+          </w:p>
+        </w:tc>
+        <w:tc>
+          <w:tcPr>
+            <w:tcW w:type="dxa" w:w="2880"/>
+          </w:tcPr>
+          <w:p>
+            <w:r>
+              <w:t>동시조음: 다음 모음 형태 미리 가짐</w:t>
+            </w:r>
+          </w:p>
+        </w:tc>
+        <w:tc>
+          <w:tcPr>
+            <w:tcW w:type="dxa" w:w="2880"/>
+          </w:tcPr>
+          <w:p>
+            <w:r>
+              <w:t>후속 모음 타깃 부분 적용 (0.3~0.5)</w:t>
+            </w:r>
+          </w:p>
+        </w:tc>
+      </w:tr>
+      <w:tr>
+        <w:tc>
+          <w:tcPr>
+            <w:tcW w:type="dxa" w:w="2880"/>
+          </w:tcPr>
+          <w:p>
+            <w:r>
+              <w:t>ㄴ + ㅣ</w:t>
+            </w:r>
+          </w:p>
+        </w:tc>
+        <w:tc>
+          <w:tcPr>
+            <w:tcW w:type="dxa" w:w="2880"/>
+          </w:tcPr>
+          <w:p>
+            <w:r>
+              <w:t>약한 구개음화 [ɲ]</w:t>
+            </w:r>
+          </w:p>
+        </w:tc>
+        <w:tc>
+          <w:tcPr>
+            <w:tcW w:type="dxa" w:w="2880"/>
+          </w:tcPr>
+          <w:p>
+            <w:r>
+              <w:t>tongue_tip_up(0.85) + tongue_front_up(0.3)</w:t>
+            </w:r>
+          </w:p>
+        </w:tc>
+      </w:tr>
+      <w:tr>
+        <w:tc>
+          <w:tcPr>
+            <w:tcW w:type="dxa" w:w="2880"/>
+          </w:tcPr>
+          <w:p>
+            <w:r>
+              <w:t>ㄹ + ㅣ</w:t>
+            </w:r>
+          </w:p>
+        </w:tc>
+        <w:tc>
+          <w:tcPr>
+            <w:tcW w:type="dxa" w:w="2880"/>
+          </w:tcPr>
+          <w:p>
+            <w:r>
+              <w:t>약한 구개화 설측 [ʎ]</w:t>
+            </w:r>
+          </w:p>
+        </w:tc>
+        <w:tc>
+          <w:tcPr>
+            <w:tcW w:type="dxa" w:w="2880"/>
+          </w:tcPr>
+          <w:p>
+            <w:r>
+              <w:t>설측음 ㄹ + tongue_front_up(0.2)</w:t>
+            </w:r>
+          </w:p>
+        </w:tc>
+      </w:tr>
+      <w:tr>
+        <w:tc>
+          <w:tcPr>
+            <w:tcW w:type="dxa" w:w="2880"/>
+          </w:tcPr>
+          <w:p>
+            <w:r>
+              <w:t>모음 사이 ㅎ</w:t>
+            </w:r>
+          </w:p>
+        </w:tc>
+        <w:tc>
+          <w:tcPr>
+            <w:tcW w:type="dxa" w:w="2880"/>
+          </w:tcPr>
+          <w:p>
+            <w:r>
+              <w:t>약화·삭제 가능</w:t>
+            </w:r>
+          </w:p>
+        </w:tc>
+        <w:tc>
+          <w:tcPr>
+            <w:tcW w:type="dxa" w:w="2880"/>
+          </w:tcPr>
+          <w:p>
+            <w:r>
+              <w:t>가중치 낮춤 또는 생략</w:t>
+            </w:r>
+          </w:p>
+        </w:tc>
+      </w:tr>
+    </w:tbl>
+    <w:p>
+      <w:pPr>
+        <w:pStyle w:val="Heading2"/>
+      </w:pPr>
+      <w:r>
+        <w:t>5.5 평음 / 격음 / 경음 차이 (참고)</w:t>
+      </w:r>
+    </w:p>
+    <w:p>
+      <w:r>
+        <w:t>ㅂ/ㅍ/ㅃ 등 3중 대립은 조음 형태는 동일하고, 성문 긴장도 + VOT(Voice Onset Time)에서 차이가 옵니다. 따라서 블렌드셰이프는 같고, 코드에서 기류 강도·지속 시간으로 구분합니다.</w:t>
+      </w:r>
+    </w:p>
+    <w:tbl>
+      <w:tblPr>
+        <w:tblStyle w:val="LightGrid-Accent1"/>
+        <w:tblW w:type="auto" w:w="0"/>
+        <w:tblLook w:firstColumn="1" w:firstRow="1" w:lastColumn="0" w:lastRow="0" w:noHBand="0" w:noVBand="1" w:val="04A0"/>
+      </w:tblPr>
+      <w:tblGrid>
+        <w:gridCol w:w="2160"/>
+        <w:gridCol w:w="2160"/>
+        <w:gridCol w:w="2160"/>
+        <w:gridCol w:w="2160"/>
+      </w:tblGrid>
+      <w:tr>
+        <w:tc>
+          <w:tcPr>
+            <w:tcW w:type="dxa" w:w="2160"/>
+          </w:tcPr>
+          <w:p>
+            <w:r>
+              <w:t>종류</w:t>
+            </w:r>
+          </w:p>
+        </w:tc>
+        <w:tc>
+          <w:tcPr>
+            <w:tcW w:type="dxa" w:w="2160"/>
+          </w:tcPr>
+          <w:p>
+            <w:r>
+              <w:t>성문 상태</w:t>
+            </w:r>
+          </w:p>
+        </w:tc>
+        <w:tc>
+          <w:tcPr>
+            <w:tcW w:type="dxa" w:w="2160"/>
+          </w:tcPr>
+          <w:p>
+            <w:r>
+              <w:t>VOT (파열음 기준)</w:t>
+            </w:r>
+          </w:p>
+        </w:tc>
+        <w:tc>
+          <w:tcPr>
+            <w:tcW w:type="dxa" w:w="2160"/>
+          </w:tcPr>
+          <w:p>
+            <w:r>
+              <w:t>기류</w:t>
+            </w:r>
+          </w:p>
+        </w:tc>
+      </w:tr>
+      <w:tr>
+        <w:tc>
+          <w:tcPr>
+            <w:tcW w:type="dxa" w:w="2160"/>
+          </w:tcPr>
+          <w:p>
+            <w:r>
+              <w:t>평음 (ㅂ ㄷ ㄱ ㅈ)</w:t>
+            </w:r>
+          </w:p>
+        </w:tc>
+        <w:tc>
+          <w:tcPr>
+            <w:tcW w:type="dxa" w:w="2160"/>
+          </w:tcPr>
+          <w:p>
+            <w:r>
+              <w:t>약간 이완</w:t>
+            </w:r>
+          </w:p>
+        </w:tc>
+        <w:tc>
+          <w:tcPr>
+            <w:tcW w:type="dxa" w:w="2160"/>
+          </w:tcPr>
+          <w:p>
+            <w:r>
+              <w:t>짧음 (~30–60ms)</w:t>
+            </w:r>
+          </w:p>
+        </w:tc>
+        <w:tc>
+          <w:tcPr>
+            <w:tcW w:type="dxa" w:w="2160"/>
+          </w:tcPr>
+          <w:p>
+            <w:r>
+              <w:t>약</w:t>
+            </w:r>
+          </w:p>
+        </w:tc>
+      </w:tr>
+      <w:tr>
+        <w:tc>
+          <w:tcPr>
+            <w:tcW w:type="dxa" w:w="2160"/>
+          </w:tcPr>
+          <w:p>
+            <w:r>
+              <w:t>격음 (ㅍ ㅌ ㅋ ㅊ)</w:t>
+            </w:r>
+          </w:p>
+        </w:tc>
+        <w:tc>
+          <w:tcPr>
+            <w:tcW w:type="dxa" w:w="2160"/>
+          </w:tcPr>
+          <w:p>
+            <w:r>
+              <w:t>이완 + 기식</w:t>
+            </w:r>
+          </w:p>
+        </w:tc>
+        <w:tc>
+          <w:tcPr>
+            <w:tcW w:type="dxa" w:w="2160"/>
+          </w:tcPr>
+          <w:p>
+            <w:r>
+              <w:t>김 (&gt;80ms, 기식 강함)</w:t>
+            </w:r>
+          </w:p>
+        </w:tc>
+        <w:tc>
+          <w:tcPr>
+            <w:tcW w:type="dxa" w:w="2160"/>
+          </w:tcPr>
+          <w:p>
+            <w:r>
+              <w:t>강</w:t>
+            </w:r>
+          </w:p>
+        </w:tc>
+      </w:tr>
+      <w:tr>
+        <w:tc>
+          <w:tcPr>
+            <w:tcW w:type="dxa" w:w="2160"/>
+          </w:tcPr>
+          <w:p>
+            <w:r>
+              <w:t>경음 (ㅃ ㄸ ㄲ ㅉ ㅆ)</w:t>
+            </w:r>
+          </w:p>
+        </w:tc>
+        <w:tc>
+          <w:tcPr>
+            <w:tcW w:type="dxa" w:w="2160"/>
+          </w:tcPr>
+          <w:p>
+            <w:r>
+              <w:t>긴장</w:t>
+            </w:r>
+          </w:p>
+        </w:tc>
+        <w:tc>
+          <w:tcPr>
+            <w:tcW w:type="dxa" w:w="2160"/>
+          </w:tcPr>
+          <w:p>
+            <w:r>
+              <w:t>매우 짧음 (&lt;20ms)</w:t>
+            </w:r>
+          </w:p>
+        </w:tc>
+        <w:tc>
+          <w:tcPr>
+            <w:tcW w:type="dxa" w:w="2160"/>
+          </w:tcPr>
+          <w:p>
+            <w:r>
+              <w:t>약 + 긴장</w:t>
             </w:r>
           </w:p>
         </w:tc>
@@ -3396,7 +3871,7 @@
     </w:p>
     <w:p>
       <w:r>
-        <w:t>변경 이력 — v2.1 (2026-05): 조음 원리 섹션 추가 (tongue_tip_up 가중치 의미 — 1.0 접촉 / 0.7~0.85 좁힘(닿지 않음) / 0~0.3 개방). 마찰음 ㅅ ㅆ는 닿지 않는 좁힘(난기류), 설측음 ㄹ는 접촉 유지 + 양옆 기류로 정정. 공기 흐름 마커에 음소별 흐름 설명 추가. v2: 풀 3D 모델, tongue_lateral_channel 추가, 한국어 음운 전체 매핑. v1: 사지철 단면 + 11개 타깃 초안.</w:t>
+        <w:t>변경 이력 — v2.2 (2026-05): 모든 음소 음성학적 재검증. ㅇ(받침) 0.9→1.0(완전 접촉), 파찰음 ㅈㅊㅉ 폐쇄+개방 2단계 명시, ㅗ 가중치 조정, ㅡ 입술 중립 명시, ㅎ 동시조음 명시. §5.4 음성학적 미세 변형(allophones), §5.5 평음/격음/경음 VOT 섹션 신설. v2.1: 조음 원리 — 접촉/좁힘/개방 가중치 명시, ㅅㅆ(닿지 않는 좁힘) ㄹ설측(접촉 유지) 정정. v2: 풀 3D 모델, tongue_lateral_channel 추가, 한국어 음운 전체 매핑. v1: 사지철 단면 + 11개 타깃 초안.</w:t>
       </w:r>
     </w:p>
     <w:sectPr>

</xml_diff>

<commit_message>
docs: bump RIGGING_SPEC to v2.3 — collapse 3-way contrasts, add nasal codas to unreleased
평음/경음/격음은 시각적으로 표현 불가하므로 분리 의미가 없음.
- 자음 표를 조음 위치·방법별 11개 그룹으로 통합 (ㅂㅍㅃ, ㄷㅌㄸ 등 한 줄)
- §5.5 (평음/격음/경음 VOT 차이) 섹션 삭제
- §5.4 받침 미파열 항목에 비음(ㅁ ㄴ ㅇ)도 포함 — 받침 비음도
  폐쇄 유지·오랄 release 없이 비강으로만 기류
</commit_message>
<xml_diff>
--- a/docs/RIGGING_SPEC.docx
+++ b/docs/RIGGING_SPEC.docx
@@ -7,7 +7,7 @@
         <w:pStyle w:val="Title"/>
       </w:pPr>
       <w:r>
-        <w:t>조음기관 3D 리깅 사양서 v2.2 (Articulator Rig Spec v2.2)</w:t>
+        <w:t>조음기관 3D 리깅 사양서 v2.3 (Articulator Rig Spec v2.3)</w:t>
       </w:r>
     </w:p>
     <w:p>
@@ -1091,7 +1091,12 @@
         <w:pStyle w:val="Heading2"/>
       </w:pPr>
       <w:r>
-        <w:t>5.1 자음 (19개)</w:t>
+        <w:t>5.1 자음 — 조음 위치·방법별 그룹 (11그룹)</w:t>
+      </w:r>
+    </w:p>
+    <w:p>
+      <w:r>
+        <w:t>조음기관 시각화에서 같은 위치·방법의 자음들은 동일한 형태를 가집니다. 평음/격음/경음 차이는 성문 긴장도·VOT에서 오며 시각적으로는 구분이 어려워 동일 그룹으로 묶습니다.</w:t>
       </w:r>
     </w:p>
     <w:tbl>
@@ -1113,7 +1118,7 @@
           </w:tcPr>
           <w:p>
             <w:r>
-              <w:t>음소</w:t>
+              <w:t>음소 그룹</w:t>
             </w:r>
           </w:p>
         </w:tc>
@@ -1133,7 +1138,7 @@
           </w:tcPr>
           <w:p>
             <w:r>
-              <w:t>위치/방법</w:t>
+              <w:t>조음위치·방법</w:t>
             </w:r>
           </w:p>
         </w:tc>
@@ -1155,7 +1160,7 @@
           </w:tcPr>
           <w:p>
             <w:r>
-              <w:t>ㅂ</w:t>
+              <w:t>ㅂ · ㅍ · ㅃ</w:t>
             </w:r>
           </w:p>
         </w:tc>
@@ -1165,7 +1170,7 @@
           </w:tcPr>
           <w:p>
             <w:r>
-              <w:t>/p/</w:t>
+              <w:t>/p/ /pʰ/ /p͈/</w:t>
             </w:r>
           </w:p>
         </w:tc>
@@ -1175,7 +1180,7 @@
           </w:tcPr>
           <w:p>
             <w:r>
-              <w:t>양순 평음 파열</w:t>
+              <w:t>양순 파열</w:t>
             </w:r>
           </w:p>
         </w:tc>
@@ -1186,90 +1191,6 @@
           <w:p>
             <w:r>
               <w:t>lips_closed(1)</w:t>
-            </w:r>
-          </w:p>
-        </w:tc>
-      </w:tr>
-      <w:tr>
-        <w:tc>
-          <w:tcPr>
-            <w:tcW w:type="dxa" w:w="2160"/>
-          </w:tcPr>
-          <w:p>
-            <w:r>
-              <w:t>ㅍ</w:t>
-            </w:r>
-          </w:p>
-        </w:tc>
-        <w:tc>
-          <w:tcPr>
-            <w:tcW w:type="dxa" w:w="2160"/>
-          </w:tcPr>
-          <w:p>
-            <w:r>
-              <w:t>/pʰ/</w:t>
-            </w:r>
-          </w:p>
-        </w:tc>
-        <w:tc>
-          <w:tcPr>
-            <w:tcW w:type="dxa" w:w="2160"/>
-          </w:tcPr>
-          <w:p>
-            <w:r>
-              <w:t>양순 격음 파열</w:t>
-            </w:r>
-          </w:p>
-        </w:tc>
-        <w:tc>
-          <w:tcPr>
-            <w:tcW w:type="dxa" w:w="2160"/>
-          </w:tcPr>
-          <w:p>
-            <w:r>
-              <w:t>lips_closed(1) [+긴 기류]</w:t>
-            </w:r>
-          </w:p>
-        </w:tc>
-      </w:tr>
-      <w:tr>
-        <w:tc>
-          <w:tcPr>
-            <w:tcW w:type="dxa" w:w="2160"/>
-          </w:tcPr>
-          <w:p>
-            <w:r>
-              <w:t>ㅃ</w:t>
-            </w:r>
-          </w:p>
-        </w:tc>
-        <w:tc>
-          <w:tcPr>
-            <w:tcW w:type="dxa" w:w="2160"/>
-          </w:tcPr>
-          <w:p>
-            <w:r>
-              <w:t>/p͈/</w:t>
-            </w:r>
-          </w:p>
-        </w:tc>
-        <w:tc>
-          <w:tcPr>
-            <w:tcW w:type="dxa" w:w="2160"/>
-          </w:tcPr>
-          <w:p>
-            <w:r>
-              <w:t>양순 경음 파열</w:t>
-            </w:r>
-          </w:p>
-        </w:tc>
-        <w:tc>
-          <w:tcPr>
-            <w:tcW w:type="dxa" w:w="2160"/>
-          </w:tcPr>
-          <w:p>
-            <w:r>
-              <w:t>lips_closed(1) [+긴장]</w:t>
             </w:r>
           </w:p>
         </w:tc>
@@ -1323,7 +1244,7 @@
           </w:tcPr>
           <w:p>
             <w:r>
-              <w:t>ㄷ</w:t>
+              <w:t>ㄷ · ㅌ · ㄸ</w:t>
             </w:r>
           </w:p>
         </w:tc>
@@ -1333,7 +1254,7 @@
           </w:tcPr>
           <w:p>
             <w:r>
-              <w:t>/t/</w:t>
+              <w:t>/t/ /tʰ/ /t͈/</w:t>
             </w:r>
           </w:p>
         </w:tc>
@@ -1343,91 +1264,7 @@
           </w:tcPr>
           <w:p>
             <w:r>
-              <w:t>치조 평음 파열</w:t>
-            </w:r>
-          </w:p>
-        </w:tc>
-        <w:tc>
-          <w:tcPr>
-            <w:tcW w:type="dxa" w:w="2160"/>
-          </w:tcPr>
-          <w:p>
-            <w:r>
-              <w:t>tongue_tip_up(1) + jaw_open(0.2)</w:t>
-            </w:r>
-          </w:p>
-        </w:tc>
-      </w:tr>
-      <w:tr>
-        <w:tc>
-          <w:tcPr>
-            <w:tcW w:type="dxa" w:w="2160"/>
-          </w:tcPr>
-          <w:p>
-            <w:r>
-              <w:t>ㅌ</w:t>
-            </w:r>
-          </w:p>
-        </w:tc>
-        <w:tc>
-          <w:tcPr>
-            <w:tcW w:type="dxa" w:w="2160"/>
-          </w:tcPr>
-          <w:p>
-            <w:r>
-              <w:t>/tʰ/</w:t>
-            </w:r>
-          </w:p>
-        </w:tc>
-        <w:tc>
-          <w:tcPr>
-            <w:tcW w:type="dxa" w:w="2160"/>
-          </w:tcPr>
-          <w:p>
-            <w:r>
-              <w:t>치조 격음 파열</w:t>
-            </w:r>
-          </w:p>
-        </w:tc>
-        <w:tc>
-          <w:tcPr>
-            <w:tcW w:type="dxa" w:w="2160"/>
-          </w:tcPr>
-          <w:p>
-            <w:r>
-              <w:t>tongue_tip_up(1) + jaw_open(0.2)</w:t>
-            </w:r>
-          </w:p>
-        </w:tc>
-      </w:tr>
-      <w:tr>
-        <w:tc>
-          <w:tcPr>
-            <w:tcW w:type="dxa" w:w="2160"/>
-          </w:tcPr>
-          <w:p>
-            <w:r>
-              <w:t>ㄸ</w:t>
-            </w:r>
-          </w:p>
-        </w:tc>
-        <w:tc>
-          <w:tcPr>
-            <w:tcW w:type="dxa" w:w="2160"/>
-          </w:tcPr>
-          <w:p>
-            <w:r>
-              <w:t>/t͈/</w:t>
-            </w:r>
-          </w:p>
-        </w:tc>
-        <w:tc>
-          <w:tcPr>
-            <w:tcW w:type="dxa" w:w="2160"/>
-          </w:tcPr>
-          <w:p>
-            <w:r>
-              <w:t>치조 경음 파열</w:t>
+              <w:t>치조 파열</w:t>
             </w:r>
           </w:p>
         </w:tc>
@@ -1491,7 +1328,7 @@
           </w:tcPr>
           <w:p>
             <w:r>
-              <w:t>ㅅ</w:t>
+              <w:t>ㅅ · ㅆ</w:t>
             </w:r>
           </w:p>
         </w:tc>
@@ -1501,7 +1338,7 @@
           </w:tcPr>
           <w:p>
             <w:r>
-              <w:t>/s/</w:t>
+              <w:t>/s/ /s͈/</w:t>
             </w:r>
           </w:p>
         </w:tc>
@@ -1511,7 +1348,7 @@
           </w:tcPr>
           <w:p>
             <w:r>
-              <w:t>치조 평음 마찰</w:t>
+              <w:t>치조 마찰</w:t>
             </w:r>
           </w:p>
         </w:tc>
@@ -1521,7 +1358,7 @@
           </w:tcPr>
           <w:p>
             <w:r>
-              <w:t>tongue_tip_up(0.75 — 닿지 않음, 좁힘만) + tongue_groove(1) + jaw_open(0.3)</w:t>
+              <w:t>tongue_tip_up(0.75~0.82, 닿지 않음, 좁힘만) + tongue_groove(1) + jaw_open(0.3)</w:t>
             </w:r>
           </w:p>
         </w:tc>
@@ -1533,7 +1370,7 @@
           </w:tcPr>
           <w:p>
             <w:r>
-              <w:t>ㅆ</w:t>
+              <w:t>ㅈ · ㅊ · ㅉ</w:t>
             </w:r>
           </w:p>
         </w:tc>
@@ -1543,7 +1380,7 @@
           </w:tcPr>
           <w:p>
             <w:r>
-              <w:t>/s͈/</w:t>
+              <w:t>/tɕ/ /tɕʰ/ /tɕ͈/</w:t>
             </w:r>
           </w:p>
         </w:tc>
@@ -1553,49 +1390,7 @@
           </w:tcPr>
           <w:p>
             <w:r>
-              <w:t>치조 경음 마찰</w:t>
-            </w:r>
-          </w:p>
-        </w:tc>
-        <w:tc>
-          <w:tcPr>
-            <w:tcW w:type="dxa" w:w="2160"/>
-          </w:tcPr>
-          <w:p>
-            <w:r>
-              <w:t>tongue_tip_up(0.82 — 더 좁은 틈, 닿지 않음) + tongue_groove(1) + jaw_open(0.3)</w:t>
-            </w:r>
-          </w:p>
-        </w:tc>
-      </w:tr>
-      <w:tr>
-        <w:tc>
-          <w:tcPr>
-            <w:tcW w:type="dxa" w:w="2160"/>
-          </w:tcPr>
-          <w:p>
-            <w:r>
-              <w:t>ㅈ</w:t>
-            </w:r>
-          </w:p>
-        </w:tc>
-        <w:tc>
-          <w:tcPr>
-            <w:tcW w:type="dxa" w:w="2160"/>
-          </w:tcPr>
-          <w:p>
-            <w:r>
-              <w:t>/tɕ/</w:t>
-            </w:r>
-          </w:p>
-        </w:tc>
-        <w:tc>
-          <w:tcPr>
-            <w:tcW w:type="dxa" w:w="2160"/>
-          </w:tcPr>
-          <w:p>
-            <w:r>
-              <w:t>치경경구개 평음 파찰</w:t>
+              <w:t>치경경구개 파찰</w:t>
             </w:r>
           </w:p>
         </w:tc>
@@ -1617,7 +1412,7 @@
           </w:tcPr>
           <w:p>
             <w:r>
-              <w:t>ㅊ</w:t>
+              <w:t>ㄱ · ㅋ · ㄲ</w:t>
             </w:r>
           </w:p>
         </w:tc>
@@ -1627,7 +1422,7 @@
           </w:tcPr>
           <w:p>
             <w:r>
-              <w:t>/tɕʰ/</w:t>
+              <w:t>/k/ /kʰ/ /k͈/</w:t>
             </w:r>
           </w:p>
         </w:tc>
@@ -1637,91 +1432,7 @@
           </w:tcPr>
           <w:p>
             <w:r>
-              <w:t>치경경구개 격음 파찰</w:t>
-            </w:r>
-          </w:p>
-        </w:tc>
-        <w:tc>
-          <w:tcPr>
-            <w:tcW w:type="dxa" w:w="2160"/>
-          </w:tcPr>
-          <w:p>
-            <w:r>
-              <w:t>tongue_front_up(1, 폐쇄 시점) + tongue_groove(0.5, 개방 시)</w:t>
-            </w:r>
-          </w:p>
-        </w:tc>
-      </w:tr>
-      <w:tr>
-        <w:tc>
-          <w:tcPr>
-            <w:tcW w:type="dxa" w:w="2160"/>
-          </w:tcPr>
-          <w:p>
-            <w:r>
-              <w:t>ㅉ</w:t>
-            </w:r>
-          </w:p>
-        </w:tc>
-        <w:tc>
-          <w:tcPr>
-            <w:tcW w:type="dxa" w:w="2160"/>
-          </w:tcPr>
-          <w:p>
-            <w:r>
-              <w:t>/tɕ͈/</w:t>
-            </w:r>
-          </w:p>
-        </w:tc>
-        <w:tc>
-          <w:tcPr>
-            <w:tcW w:type="dxa" w:w="2160"/>
-          </w:tcPr>
-          <w:p>
-            <w:r>
-              <w:t>치경경구개 경음 파찰</w:t>
-            </w:r>
-          </w:p>
-        </w:tc>
-        <w:tc>
-          <w:tcPr>
-            <w:tcW w:type="dxa" w:w="2160"/>
-          </w:tcPr>
-          <w:p>
-            <w:r>
-              <w:t>tongue_front_up(1, 폐쇄 시점) + tongue_groove(0.5, 개방 시)</w:t>
-            </w:r>
-          </w:p>
-        </w:tc>
-      </w:tr>
-      <w:tr>
-        <w:tc>
-          <w:tcPr>
-            <w:tcW w:type="dxa" w:w="2160"/>
-          </w:tcPr>
-          <w:p>
-            <w:r>
-              <w:t>ㄱ</w:t>
-            </w:r>
-          </w:p>
-        </w:tc>
-        <w:tc>
-          <w:tcPr>
-            <w:tcW w:type="dxa" w:w="2160"/>
-          </w:tcPr>
-          <w:p>
-            <w:r>
-              <w:t>/k/</w:t>
-            </w:r>
-          </w:p>
-        </w:tc>
-        <w:tc>
-          <w:tcPr>
-            <w:tcW w:type="dxa" w:w="2160"/>
-          </w:tcPr>
-          <w:p>
-            <w:r>
-              <w:t>연구개 평음 파열</w:t>
+              <w:t>연구개 파열</w:t>
             </w:r>
           </w:p>
         </w:tc>
@@ -1743,91 +1454,7 @@
           </w:tcPr>
           <w:p>
             <w:r>
-              <w:t>ㅋ</w:t>
-            </w:r>
-          </w:p>
-        </w:tc>
-        <w:tc>
-          <w:tcPr>
-            <w:tcW w:type="dxa" w:w="2160"/>
-          </w:tcPr>
-          <w:p>
-            <w:r>
-              <w:t>/kʰ/</w:t>
-            </w:r>
-          </w:p>
-        </w:tc>
-        <w:tc>
-          <w:tcPr>
-            <w:tcW w:type="dxa" w:w="2160"/>
-          </w:tcPr>
-          <w:p>
-            <w:r>
-              <w:t>연구개 격음 파열</w:t>
-            </w:r>
-          </w:p>
-        </w:tc>
-        <w:tc>
-          <w:tcPr>
-            <w:tcW w:type="dxa" w:w="2160"/>
-          </w:tcPr>
-          <w:p>
-            <w:r>
-              <w:t>tongue_back_up(1)</w:t>
-            </w:r>
-          </w:p>
-        </w:tc>
-      </w:tr>
-      <w:tr>
-        <w:tc>
-          <w:tcPr>
-            <w:tcW w:type="dxa" w:w="2160"/>
-          </w:tcPr>
-          <w:p>
-            <w:r>
-              <w:t>ㄲ</w:t>
-            </w:r>
-          </w:p>
-        </w:tc>
-        <w:tc>
-          <w:tcPr>
-            <w:tcW w:type="dxa" w:w="2160"/>
-          </w:tcPr>
-          <w:p>
-            <w:r>
-              <w:t>/k͈/</w:t>
-            </w:r>
-          </w:p>
-        </w:tc>
-        <w:tc>
-          <w:tcPr>
-            <w:tcW w:type="dxa" w:w="2160"/>
-          </w:tcPr>
-          <w:p>
-            <w:r>
-              <w:t>연구개 경음 파열</w:t>
-            </w:r>
-          </w:p>
-        </w:tc>
-        <w:tc>
-          <w:tcPr>
-            <w:tcW w:type="dxa" w:w="2160"/>
-          </w:tcPr>
-          <w:p>
-            <w:r>
-              <w:t>tongue_back_up(1)</w:t>
-            </w:r>
-          </w:p>
-        </w:tc>
-      </w:tr>
-      <w:tr>
-        <w:tc>
-          <w:tcPr>
-            <w:tcW w:type="dxa" w:w="2160"/>
-          </w:tcPr>
-          <w:p>
-            <w:r>
-              <w:t>ㅇ(받침)</w:t>
+              <w:t>ㅇ (받침)</w:t>
             </w:r>
           </w:p>
         </w:tc>
@@ -1899,7 +1526,7 @@
           </w:tcPr>
           <w:p>
             <w:r>
-              <w:t>tongue_tip_up(1.0 — 순간 접촉) [짧게 반복]</w:t>
+              <w:t>tongue_tip_up(1.0, 순간 접촉) [짧게 반복]</w:t>
             </w:r>
           </w:p>
         </w:tc>
@@ -1941,7 +1568,7 @@
           </w:tcPr>
           <w:p>
             <w:r>
-              <w:t>tongue_tip_up(1.0 — 접촉 유지) + tongue_lateral_channel(1)</w:t>
+              <w:t>tongue_tip_up(1.0, 접촉 유지) + tongue_lateral_channel(1)</w:t>
             </w:r>
           </w:p>
         </w:tc>
@@ -1989,11 +1616,6 @@
         </w:tc>
       </w:tr>
     </w:tbl>
-    <w:p>
-      <w:r>
-        <w:t>※ 평음/격음/경음(ㅂ/ㅍ/ㅃ 등)은 같은 조음 형태, 기류 강도·긴장도만 다름 → 같은 블렌드셰이프, 코드에서 기류 강도로 구분.</w:t>
-      </w:r>
-    </w:p>
     <w:p>
       <w:pPr>
         <w:pStyle w:val="Heading2"/>
@@ -3075,7 +2697,7 @@
           </w:tcPr>
           <w:p>
             <w:r>
-              <w:t>받침 위치 폐쇄음(ㅂ/ㄷ/ㄱ)</w:t>
+              <w:t>받침 위치 폐쇄음·비음 (ㅂ/ㄷ/ㄱ + ㅁ/ㄴ/ㅇ)</w:t>
             </w:r>
           </w:p>
         </w:tc>
@@ -3085,7 +2707,7 @@
           </w:tcPr>
           <w:p>
             <w:r>
-              <w:t>미파열(unreleased) — 폐쇄만, 개방 없음</w:t>
+              <w:t>미파열(unreleased) — 폐쇄 유지, 입쪽 release 없음. 비음은 비강으로만 기류 지속</w:t>
             </w:r>
           </w:p>
         </w:tc>
@@ -3095,7 +2717,7 @@
           </w:tcPr>
           <w:p>
             <w:r>
-              <w:t>jaw_open 0 유지, release 단계 생략</w:t>
+              <w:t>해당 조음 타깃 유지(lips_closed/tongue_tip_up/tongue_back_up), jaw_open 0 유지, release 단계 생략</w:t>
             </w:r>
           </w:p>
         </w:tc>
@@ -3288,200 +2910,6 @@
           <w:p>
             <w:r>
               <w:t>가중치 낮춤 또는 생략</w:t>
-            </w:r>
-          </w:p>
-        </w:tc>
-      </w:tr>
-    </w:tbl>
-    <w:p>
-      <w:pPr>
-        <w:pStyle w:val="Heading2"/>
-      </w:pPr>
-      <w:r>
-        <w:t>5.5 평음 / 격음 / 경음 차이 (참고)</w:t>
-      </w:r>
-    </w:p>
-    <w:p>
-      <w:r>
-        <w:t>ㅂ/ㅍ/ㅃ 등 3중 대립은 조음 형태는 동일하고, 성문 긴장도 + VOT(Voice Onset Time)에서 차이가 옵니다. 따라서 블렌드셰이프는 같고, 코드에서 기류 강도·지속 시간으로 구분합니다.</w:t>
-      </w:r>
-    </w:p>
-    <w:tbl>
-      <w:tblPr>
-        <w:tblStyle w:val="LightGrid-Accent1"/>
-        <w:tblW w:type="auto" w:w="0"/>
-        <w:tblLook w:firstColumn="1" w:firstRow="1" w:lastColumn="0" w:lastRow="0" w:noHBand="0" w:noVBand="1" w:val="04A0"/>
-      </w:tblPr>
-      <w:tblGrid>
-        <w:gridCol w:w="2160"/>
-        <w:gridCol w:w="2160"/>
-        <w:gridCol w:w="2160"/>
-        <w:gridCol w:w="2160"/>
-      </w:tblGrid>
-      <w:tr>
-        <w:tc>
-          <w:tcPr>
-            <w:tcW w:type="dxa" w:w="2160"/>
-          </w:tcPr>
-          <w:p>
-            <w:r>
-              <w:t>종류</w:t>
-            </w:r>
-          </w:p>
-        </w:tc>
-        <w:tc>
-          <w:tcPr>
-            <w:tcW w:type="dxa" w:w="2160"/>
-          </w:tcPr>
-          <w:p>
-            <w:r>
-              <w:t>성문 상태</w:t>
-            </w:r>
-          </w:p>
-        </w:tc>
-        <w:tc>
-          <w:tcPr>
-            <w:tcW w:type="dxa" w:w="2160"/>
-          </w:tcPr>
-          <w:p>
-            <w:r>
-              <w:t>VOT (파열음 기준)</w:t>
-            </w:r>
-          </w:p>
-        </w:tc>
-        <w:tc>
-          <w:tcPr>
-            <w:tcW w:type="dxa" w:w="2160"/>
-          </w:tcPr>
-          <w:p>
-            <w:r>
-              <w:t>기류</w:t>
-            </w:r>
-          </w:p>
-        </w:tc>
-      </w:tr>
-      <w:tr>
-        <w:tc>
-          <w:tcPr>
-            <w:tcW w:type="dxa" w:w="2160"/>
-          </w:tcPr>
-          <w:p>
-            <w:r>
-              <w:t>평음 (ㅂ ㄷ ㄱ ㅈ)</w:t>
-            </w:r>
-          </w:p>
-        </w:tc>
-        <w:tc>
-          <w:tcPr>
-            <w:tcW w:type="dxa" w:w="2160"/>
-          </w:tcPr>
-          <w:p>
-            <w:r>
-              <w:t>약간 이완</w:t>
-            </w:r>
-          </w:p>
-        </w:tc>
-        <w:tc>
-          <w:tcPr>
-            <w:tcW w:type="dxa" w:w="2160"/>
-          </w:tcPr>
-          <w:p>
-            <w:r>
-              <w:t>짧음 (~30–60ms)</w:t>
-            </w:r>
-          </w:p>
-        </w:tc>
-        <w:tc>
-          <w:tcPr>
-            <w:tcW w:type="dxa" w:w="2160"/>
-          </w:tcPr>
-          <w:p>
-            <w:r>
-              <w:t>약</w:t>
-            </w:r>
-          </w:p>
-        </w:tc>
-      </w:tr>
-      <w:tr>
-        <w:tc>
-          <w:tcPr>
-            <w:tcW w:type="dxa" w:w="2160"/>
-          </w:tcPr>
-          <w:p>
-            <w:r>
-              <w:t>격음 (ㅍ ㅌ ㅋ ㅊ)</w:t>
-            </w:r>
-          </w:p>
-        </w:tc>
-        <w:tc>
-          <w:tcPr>
-            <w:tcW w:type="dxa" w:w="2160"/>
-          </w:tcPr>
-          <w:p>
-            <w:r>
-              <w:t>이완 + 기식</w:t>
-            </w:r>
-          </w:p>
-        </w:tc>
-        <w:tc>
-          <w:tcPr>
-            <w:tcW w:type="dxa" w:w="2160"/>
-          </w:tcPr>
-          <w:p>
-            <w:r>
-              <w:t>김 (&gt;80ms, 기식 강함)</w:t>
-            </w:r>
-          </w:p>
-        </w:tc>
-        <w:tc>
-          <w:tcPr>
-            <w:tcW w:type="dxa" w:w="2160"/>
-          </w:tcPr>
-          <w:p>
-            <w:r>
-              <w:t>강</w:t>
-            </w:r>
-          </w:p>
-        </w:tc>
-      </w:tr>
-      <w:tr>
-        <w:tc>
-          <w:tcPr>
-            <w:tcW w:type="dxa" w:w="2160"/>
-          </w:tcPr>
-          <w:p>
-            <w:r>
-              <w:t>경음 (ㅃ ㄸ ㄲ ㅉ ㅆ)</w:t>
-            </w:r>
-          </w:p>
-        </w:tc>
-        <w:tc>
-          <w:tcPr>
-            <w:tcW w:type="dxa" w:w="2160"/>
-          </w:tcPr>
-          <w:p>
-            <w:r>
-              <w:t>긴장</w:t>
-            </w:r>
-          </w:p>
-        </w:tc>
-        <w:tc>
-          <w:tcPr>
-            <w:tcW w:type="dxa" w:w="2160"/>
-          </w:tcPr>
-          <w:p>
-            <w:r>
-              <w:t>매우 짧음 (&lt;20ms)</w:t>
-            </w:r>
-          </w:p>
-        </w:tc>
-        <w:tc>
-          <w:tcPr>
-            <w:tcW w:type="dxa" w:w="2160"/>
-          </w:tcPr>
-          <w:p>
-            <w:r>
-              <w:t>약 + 긴장</w:t>
             </w:r>
           </w:p>
         </w:tc>
@@ -3871,7 +3299,7 @@
     </w:p>
     <w:p>
       <w:r>
-        <w:t>변경 이력 — v2.2 (2026-05): 모든 음소 음성학적 재검증. ㅇ(받침) 0.9→1.0(완전 접촉), 파찰음 ㅈㅊㅉ 폐쇄+개방 2단계 명시, ㅗ 가중치 조정, ㅡ 입술 중립 명시, ㅎ 동시조음 명시. §5.4 음성학적 미세 변형(allophones), §5.5 평음/격음/경음 VOT 섹션 신설. v2.1: 조음 원리 — 접촉/좁힘/개방 가중치 명시, ㅅㅆ(닿지 않는 좁힘) ㄹ설측(접촉 유지) 정정. v2: 풀 3D 모델, tongue_lateral_channel 추가, 한국어 음운 전체 매핑. v1: 사지철 단면 + 11개 타깃 초안.</w:t>
+        <w:t>변경 이력 — v2.3 (2026-05): 자음 표를 조음 위치·방법별 그룹(11그룹)으로 통합 (평음/격음/경음은 시각적 구분 불가 → 동일 그룹). §5.5(평음/격음/경음 VOT) 섹션 삭제. §5.4 받침 미파열 항목에 비음(ㅁ ㄴ ㅇ)도 포함. v2.2: 모든 음소 음성학적 재검증. ㅇ(받침) 0.9→1.0, 파찰음 폐쇄+개방 명시, ㅗ ㅡ 가중치 조정, ㅎ 동시조음 명시, §5.4 allophones 섹션 신설. v2.1: 조음 원리(접촉/좁힘/개방) 명시, ㅅㅆ ㄹ설측 정정. v2: 풀 3D 모델, tongue_lateral_channel 추가, 한국어 음운 전체 매핑. v1: 사지철 단면 + 11개 타깃 초안.</w:t>
       </w:r>
     </w:p>
     <w:sectPr>

</xml_diff>

<commit_message>
docs: bump RIGGING_SPEC to v2.4 — combined GLB structure notes
§8 통합 3D 데이터(head-combined.glb) 참고 섹션 신설.
- 파일 구조: 단일 GLB, head/tongue/lips 세 노드 분리
- 좌표 규약: +X 정면, +Y 위, meter, Y-up
- 혀: 약 61k 정점, median sulcus 사전 모델링, 변환값 명시
- 입술: 약 162k 정점, 정면 디테일 양호, 아티팩트 정리·별도 머티리얼 요청
- 머리: 기존 사지철 단면 그대로
- 위치 미세조정 안내 (리토폴로지 시 자연 조정 가능)
기존 §8(웹 연동)은 §9로 이동.
RIGGING_SPEC_FULL.pdf 재생성 (18쪽).
</commit_message>
<xml_diff>
--- a/docs/RIGGING_SPEC.docx
+++ b/docs/RIGGING_SPEC.docx
@@ -7,7 +7,7 @@
         <w:pStyle w:val="Title"/>
       </w:pPr>
       <w:r>
-        <w:t>조음기관 3D 리깅 사양서 v2.3 (Articulator Rig Spec v2.3)</w:t>
+        <w:t>조음기관 3D 리깅 사양서 v2.4 (Articulator Rig Spec v2.4)</w:t>
       </w:r>
     </w:p>
     <w:p>
@@ -3270,7 +3270,241 @@
         <w:pStyle w:val="Heading1"/>
       </w:pPr>
       <w:r>
-        <w:t>8. 웹 연동 (참고)</w:t>
+        <w:t>8. 통합 3D 데이터 (head-combined.glb) 참고</w:t>
+      </w:r>
+    </w:p>
+    <w:p>
+      <w:r>
+        <w:t>전달드린 통합 GLB의 구조와 각 부위의 사전 정보입니다. 리토폴로지 시작점으로 활용해 주세요.</w:t>
+      </w:r>
+    </w:p>
+    <w:p>
+      <w:pPr>
+        <w:pStyle w:val="Heading2"/>
+      </w:pPr>
+      <w:r>
+        <w:t>8.1 파일 구조</w:t>
+      </w:r>
+    </w:p>
+    <w:p>
+      <w:pPr>
+        <w:pStyle w:val="ListBullet"/>
+      </w:pPr>
+      <w:r>
+        <w:t>단일 .glb (텍스처 임베드 / Y-up / meter)</w:t>
+      </w:r>
+    </w:p>
+    <w:p>
+      <w:pPr>
+        <w:pStyle w:val="ListBullet"/>
+      </w:pPr>
+      <w:r>
+        <w:t>단일 scene · 단일 buffer</w:t>
+      </w:r>
+    </w:p>
+    <w:p>
+      <w:pPr>
+        <w:pStyle w:val="ListBullet"/>
+      </w:pPr>
+      <w:r>
+        <w:t>세 노드 분리: head (사지철 단면 머리), tongue (풀 3D 혀, Meshy AI), lips (풀 3D 입술, Meshy AI)</w:t>
+      </w:r>
+    </w:p>
+    <w:p>
+      <w:pPr>
+        <w:pStyle w:val="Heading2"/>
+      </w:pPr>
+      <w:r>
+        <w:t>8.2 좌표 규약 (통합 모델)</w:t>
+      </w:r>
+    </w:p>
+    <w:p>
+      <w:pPr>
+        <w:pStyle w:val="ListBullet"/>
+      </w:pPr>
+      <w:r>
+        <w:t>+X = 정면 (anterior, 코·입술 방향)</w:t>
+      </w:r>
+    </w:p>
+    <w:p>
+      <w:pPr>
+        <w:pStyle w:val="ListBullet"/>
+      </w:pPr>
+      <w:r>
+        <w:t>+Y = 위 (superior)</w:t>
+      </w:r>
+    </w:p>
+    <w:p>
+      <w:pPr>
+        <w:pStyle w:val="ListBullet"/>
+      </w:pPr>
+      <w:r>
+        <w:t>단위: meter</w:t>
+      </w:r>
+    </w:p>
+    <w:p>
+      <w:pPr>
+        <w:pStyle w:val="Heading2"/>
+      </w:pPr>
+      <w:r>
+        <w:t>8.3 혀 (tongue) 노드</w:t>
+      </w:r>
+    </w:p>
+    <w:p>
+      <w:pPr>
+        <w:pStyle w:val="ListBullet"/>
+      </w:pPr>
+      <w:r>
+        <w:t>정점 약 61,000, 단일 메시</w:t>
+      </w:r>
+    </w:p>
+    <w:p>
+      <w:pPr>
+        <w:pStyle w:val="ListBullet"/>
+      </w:pPr>
+      <w:r>
+        <w:t>적용된 변환: 회전 -90°(Y축), 스케일 0.28, 위치 (0.05, -0.05, 0)</w:t>
+      </w:r>
+    </w:p>
+    <w:p>
+      <w:pPr>
+        <w:pStyle w:val="ListBullet"/>
+      </w:pPr>
+      <w:r>
+        <w:t>로컬 좌표: +Z = 혀끝, +Y = 윗면(dorsum)</w:t>
+      </w:r>
+    </w:p>
+    <w:p>
+      <w:pPr>
+        <w:pStyle w:val="ListBullet"/>
+      </w:pPr>
+      <w:r>
+        <w:t>중앙 세로 홈(median sulcus)이 이미 형태에 포함되어 있음 — 혀 길이의 약 85% 구간에서 확인. tongue_groove 블렌드셰이프 베이스로 활용 가능.</w:t>
+      </w:r>
+    </w:p>
+    <w:p>
+      <w:pPr>
+        <w:pStyle w:val="ListBullet"/>
+      </w:pPr>
+      <w:r>
+        <w:t>측면 가장자리는 자연스럽게 낮음 → tongue_lateral_channel 베이스로 활용 가능.</w:t>
+      </w:r>
+    </w:p>
+    <w:p>
+      <w:pPr>
+        <w:pStyle w:val="ListBullet"/>
+      </w:pPr>
+      <w:r>
+        <w:t>텍스처는 단순 분홍 패턴(해부 디테일 없음) → 리토폴로지 후 재맵핑 필요.</w:t>
+      </w:r>
+    </w:p>
+    <w:p>
+      <w:pPr>
+        <w:pStyle w:val="Heading2"/>
+      </w:pPr>
+      <w:r>
+        <w:t>8.4 입술 (lips) 노드</w:t>
+      </w:r>
+    </w:p>
+    <w:p>
+      <w:pPr>
+        <w:pStyle w:val="ListBullet"/>
+      </w:pPr>
+      <w:r>
+        <w:t>정점 약 162,000, 단일 메시</w:t>
+      </w:r>
+    </w:p>
+    <w:p>
+      <w:pPr>
+        <w:pStyle w:val="ListBullet"/>
+      </w:pPr>
+      <w:r>
+        <w:t>적용된 변환: 회전 +90°(Y축), 스케일 0.14, 위치 (0.38, -0.02, 0)</w:t>
+      </w:r>
+    </w:p>
+    <w:p>
+      <w:pPr>
+        <w:pStyle w:val="ListBullet"/>
+      </w:pPr>
+      <w:r>
+        <w:t>정면 뷰가 명확함 (입꼬리·큐피드 보우·입술 사이 자연스러운 틈)</w:t>
+      </w:r>
+    </w:p>
+    <w:p>
+      <w:pPr>
+        <w:pStyle w:val="ListBullet"/>
+      </w:pPr>
+      <w:r>
+        <w:t>측면/위 뷰에 작은 아티팩트(연장된 부분·분리 덩어리) 있음 → 리토폴로지 단계에서 정리 부탁드립니다.</w:t>
+      </w:r>
+    </w:p>
+    <w:p>
+      <w:pPr>
+        <w:pStyle w:val="ListBullet"/>
+      </w:pPr>
+      <w:r>
+        <w:t>별도 머티리얼 유지 — 저희 코드에서 음소별로 입술 투명도를 독립 제어하기 위함입니다.</w:t>
+      </w:r>
+    </w:p>
+    <w:p>
+      <w:pPr>
+        <w:pStyle w:val="ListBullet"/>
+      </w:pPr>
+      <w:r>
+        <w:t>텍스처는 셔플 아틀라스 → 재맵핑 필요.</w:t>
+      </w:r>
+    </w:p>
+    <w:p>
+      <w:pPr>
+        <w:pStyle w:val="Heading2"/>
+      </w:pPr>
+      <w:r>
+        <w:t>8.5 머리 (head) 노드</w:t>
+      </w:r>
+    </w:p>
+    <w:p>
+      <w:pPr>
+        <w:pStyle w:val="ListBullet"/>
+      </w:pPr>
+      <w:r>
+        <w:t>기존 사지철 단면 모델 그대로 (Y축 ±0.95, X축 ±0.52, Z축 ±0.076의 얇은 슬랩)</w:t>
+      </w:r>
+    </w:p>
+    <w:p>
+      <w:pPr>
+        <w:pStyle w:val="ListBullet"/>
+      </w:pPr>
+      <w:r>
+        <w:t>머리·구개·턱·비강 anatomy 맥락 제공</w:t>
+      </w:r>
+    </w:p>
+    <w:p>
+      <w:pPr>
+        <w:pStyle w:val="ListBullet"/>
+      </w:pPr>
+      <w:r>
+        <w:t>텍스처 유지 권장 (가능한 범위에서)</w:t>
+      </w:r>
+    </w:p>
+    <w:p>
+      <w:pPr>
+        <w:pStyle w:val="Heading2"/>
+      </w:pPr>
+      <w:r>
+        <w:t>8.6 위치 미세조정 안내</w:t>
+      </w:r>
+    </w:p>
+    <w:p>
+      <w:r>
+        <w:t>혀와 입술의 위치는 1차 정렬값이며 리토폴로지 시 자연스럽게 조정하셔도 됩니다. 핵심은 12개 블렌드셰이프가 사양서대로 작동하는 것입니다.</w:t>
+      </w:r>
+    </w:p>
+    <w:p>
+      <w:pPr>
+        <w:pStyle w:val="Heading1"/>
+      </w:pPr>
+      <w:r>
+        <w:t>9. 웹 연동 (참고)</w:t>
       </w:r>
     </w:p>
     <w:p>
@@ -3299,7 +3533,7 @@
     </w:p>
     <w:p>
       <w:r>
-        <w:t>변경 이력 — v2.3 (2026-05): 자음 표를 조음 위치·방법별 그룹(11그룹)으로 통합 (평음/격음/경음은 시각적 구분 불가 → 동일 그룹). §5.5(평음/격음/경음 VOT) 섹션 삭제. §5.4 받침 미파열 항목에 비음(ㅁ ㄴ ㅇ)도 포함. v2.2: 모든 음소 음성학적 재검증. ㅇ(받침) 0.9→1.0, 파찰음 폐쇄+개방 명시, ㅗ ㅡ 가중치 조정, ㅎ 동시조음 명시, §5.4 allophones 섹션 신설. v2.1: 조음 원리(접촉/좁힘/개방) 명시, ㅅㅆ ㄹ설측 정정. v2: 풀 3D 모델, tongue_lateral_channel 추가, 한국어 음운 전체 매핑. v1: 사지철 단면 + 11개 타깃 초안.</w:t>
+        <w:t>변경 이력 — v2.4 (2026-05): §8 통합 3D 데이터(head-combined.glb) 참고 섹션 신설 — 파일 구조(head/tongue/lips 노드), 좌표 규약, 부위별 변환 매개변수, 사전 정보 (혀의 median sulcus 사전 모델링, 입술 아티팩트 정리·별도 머티리얼 요청 등). 기존 §8(웹 연동)은 §9로 이동. v2.3: 자음 표를 조음 위치·방법별 그룹(11그룹)으로 통합 (평음/격음/경음은 시각적 구분 불가 → 동일 그룹). §5.5(VOT) 섹션 삭제. §5.4 받침 미파열 항목에 비음도 포함. v2.2: 모든 음소 음성학적 재검증. ㅇ(받침) 0.9→1.0, 파찰음 폐쇄+개방 명시, ㅎ 동시조음 명시, §5.4 allophones 섹션 신설. v2.1: 조음 원리(접촉/좁힘/개방) 명시, ㅅㅆ ㄹ설측 정정. v2: 풀 3D 모델, tongue_lateral_channel 추가, 한국어 음운 전체 매핑. v1: 사지철 단면 + 11개 타깃 초안.</w:t>
       </w:r>
     </w:p>
     <w:sectPr>

</xml_diff>

<commit_message>
docs: revise RIGGING_SPEC §8 — 3 separate files instead of combined GLB
리거에게 보내는 데이터는 통합 GLB가 아니라 3개 분리 .glb (사지철 머리 +
풀 3D 혀 + 풀 3D 입술)임을 반영. §8을 파일 구성·좌표·통합 안내 위주로
재작성. 헤드의 두께(슬랩 치수) 명시 제거, 통합 시 자연스러운 위치 조정
권고로 단순화. 12개 블렌드셰이프 정의·이름은 변동 없음.
</commit_message>
<xml_diff>
--- a/docs/RIGGING_SPEC.docx
+++ b/docs/RIGGING_SPEC.docx
@@ -3270,12 +3270,12 @@
         <w:pStyle w:val="Heading1"/>
       </w:pPr>
       <w:r>
-        <w:t>8. 통합 3D 데이터 (head-combined.glb) 참고</w:t>
+        <w:t>8. 전달 3D 데이터 (3개 분리 파일) 참고</w:t>
       </w:r>
     </w:p>
     <w:p>
       <w:r>
-        <w:t>전달드린 통합 GLB의 구조와 각 부위의 사전 정보입니다. 리토폴로지 시작점으로 활용해 주세요.</w:t>
+        <w:t>전달드린 세 개의 분리 .glb 파일과 각 부위의 사전 정보입니다. 리토폴로지 시 세 파일을 통합해 주세요.</w:t>
       </w:r>
     </w:p>
     <w:p>
@@ -3283,31 +3283,152 @@
         <w:pStyle w:val="Heading2"/>
       </w:pPr>
       <w:r>
-        <w:t>8.1 파일 구조</w:t>
+        <w:t>8.1 파일 구성</w:t>
       </w:r>
     </w:p>
+    <w:tbl>
+      <w:tblPr>
+        <w:tblStyle w:val="LightGrid-Accent1"/>
+        <w:tblW w:type="auto" w:w="0"/>
+        <w:tblLook w:firstColumn="1" w:firstRow="1" w:lastColumn="0" w:lastRow="0" w:noHBand="0" w:noVBand="1" w:val="04A0"/>
+      </w:tblPr>
+      <w:tblGrid>
+        <w:gridCol w:w="2880"/>
+        <w:gridCol w:w="2880"/>
+        <w:gridCol w:w="2880"/>
+      </w:tblGrid>
+      <w:tr>
+        <w:tc>
+          <w:tcPr>
+            <w:tcW w:type="dxa" w:w="2880"/>
+          </w:tcPr>
+          <w:p>
+            <w:r>
+              <w:t>파일</w:t>
+            </w:r>
+          </w:p>
+        </w:tc>
+        <w:tc>
+          <w:tcPr>
+            <w:tcW w:type="dxa" w:w="2880"/>
+          </w:tcPr>
+          <w:p>
+            <w:r>
+              <w:t>내용</w:t>
+            </w:r>
+          </w:p>
+        </w:tc>
+        <w:tc>
+          <w:tcPr>
+            <w:tcW w:type="dxa" w:w="2880"/>
+          </w:tcPr>
+          <w:p>
+            <w:r>
+              <w:t>정점 수(대략)</w:t>
+            </w:r>
+          </w:p>
+        </w:tc>
+      </w:tr>
+      <w:tr>
+        <w:tc>
+          <w:tcPr>
+            <w:tcW w:type="dxa" w:w="2880"/>
+          </w:tcPr>
+          <w:p>
+            <w:r>
+              <w:t>사지철 머리 .glb</w:t>
+            </w:r>
+          </w:p>
+        </w:tc>
+        <w:tc>
+          <w:tcPr>
+            <w:tcW w:type="dxa" w:w="2880"/>
+          </w:tcPr>
+          <w:p>
+            <w:r>
+              <w:t>머리·구개·턱·비강 anatomy 맥락 (기존 전달본)</w:t>
+            </w:r>
+          </w:p>
+        </w:tc>
+        <w:tc>
+          <w:tcPr>
+            <w:tcW w:type="dxa" w:w="2880"/>
+          </w:tcPr>
+          <w:p>
+            <w:r>
+              <w:t>—</w:t>
+            </w:r>
+          </w:p>
+        </w:tc>
+      </w:tr>
+      <w:tr>
+        <w:tc>
+          <w:tcPr>
+            <w:tcW w:type="dxa" w:w="2880"/>
+          </w:tcPr>
+          <w:p>
+            <w:r>
+              <w:t>풀 3D 혀 .glb</w:t>
+            </w:r>
+          </w:p>
+        </w:tc>
+        <w:tc>
+          <w:tcPr>
+            <w:tcW w:type="dxa" w:w="2880"/>
+          </w:tcPr>
+          <w:p>
+            <w:r>
+              <w:t>Meshy AI 생성, 풀 3D 혀 본체</w:t>
+            </w:r>
+          </w:p>
+        </w:tc>
+        <w:tc>
+          <w:tcPr>
+            <w:tcW w:type="dxa" w:w="2880"/>
+          </w:tcPr>
+          <w:p>
+            <w:r>
+              <w:t>약 61,000</w:t>
+            </w:r>
+          </w:p>
+        </w:tc>
+      </w:tr>
+      <w:tr>
+        <w:tc>
+          <w:tcPr>
+            <w:tcW w:type="dxa" w:w="2880"/>
+          </w:tcPr>
+          <w:p>
+            <w:r>
+              <w:t>풀 3D 입술 .glb</w:t>
+            </w:r>
+          </w:p>
+        </w:tc>
+        <w:tc>
+          <w:tcPr>
+            <w:tcW w:type="dxa" w:w="2880"/>
+          </w:tcPr>
+          <w:p>
+            <w:r>
+              <w:t>Meshy AI 생성, 풀 3D 입술</w:t>
+            </w:r>
+          </w:p>
+        </w:tc>
+        <w:tc>
+          <w:tcPr>
+            <w:tcW w:type="dxa" w:w="2880"/>
+          </w:tcPr>
+          <w:p>
+            <w:r>
+              <w:t>약 162,000</w:t>
+            </w:r>
+          </w:p>
+        </w:tc>
+      </w:tr>
+    </w:tbl>
     <w:p>
-      <w:pPr>
-        <w:pStyle w:val="ListBullet"/>
-      </w:pPr>
       <w:r>
-        <w:t>단일 .glb (텍스처 임베드 / Y-up / meter)</w:t>
-      </w:r>
-    </w:p>
-    <w:p>
-      <w:pPr>
-        <w:pStyle w:val="ListBullet"/>
-      </w:pPr>
-      <w:r>
-        <w:t>단일 scene · 단일 buffer</w:t>
-      </w:r>
-    </w:p>
-    <w:p>
-      <w:pPr>
-        <w:pStyle w:val="ListBullet"/>
-      </w:pPr>
-      <w:r>
-        <w:t>세 노드 분리: head (사지철 단면 머리), tongue (풀 3D 혀, Meshy AI), lips (풀 3D 입술, Meshy AI)</w:t>
+        <w:t>모두 텍스처 임베드, Y-up. 좌표축은 각 파일이 다르므로 §8.3·8.4에 명시.</w:t>
       </w:r>
     </w:p>
     <w:p>
@@ -3315,7 +3436,7 @@
         <w:pStyle w:val="Heading2"/>
       </w:pPr>
       <w:r>
-        <w:t>8.2 좌표 규약 (통합 모델)</w:t>
+        <w:t>8.2 통합 시 좌표 규약 (목표 모델 기준)</w:t>
       </w:r>
     </w:p>
     <w:p>
@@ -3347,7 +3468,7 @@
         <w:pStyle w:val="Heading2"/>
       </w:pPr>
       <w:r>
-        <w:t>8.3 혀 (tongue) 노드</w:t>
+        <w:t>8.3 혀 파일</w:t>
       </w:r>
     </w:p>
     <w:p>
@@ -3355,7 +3476,7 @@
         <w:pStyle w:val="ListBullet"/>
       </w:pPr>
       <w:r>
-        <w:t>정점 약 61,000, 단일 메시</w:t>
+        <w:t>단일 메시, 약 61,000 정점</w:t>
       </w:r>
     </w:p>
     <w:p>
@@ -3363,7 +3484,7 @@
         <w:pStyle w:val="ListBullet"/>
       </w:pPr>
       <w:r>
-        <w:t>적용된 변환: 회전 -90°(Y축), 스케일 0.28, 위치 (0.05, -0.05, 0)</w:t>
+        <w:t>로컬 좌표: +Z = 혀끝(anterior), +Y = 윗면(dorsum), X = 좌우</w:t>
       </w:r>
     </w:p>
     <w:p>
@@ -3371,7 +3492,7 @@
         <w:pStyle w:val="ListBullet"/>
       </w:pPr>
       <w:r>
-        <w:t>로컬 좌표: +Z = 혀끝, +Y = 윗면(dorsum)</w:t>
+        <w:t>크기: Z 길이 약 1.9, X 폭 약 1.0, Y 두께 약 0.7 (Meshy 단위)</w:t>
       </w:r>
     </w:p>
     <w:p>
@@ -3400,10 +3521,18 @@
     </w:p>
     <w:p>
       <w:pPr>
+        <w:pStyle w:val="ListBullet"/>
+      </w:pPr>
+      <w:r>
+        <w:t>통합 시 회전(+Z 혀끝 → 머리 +X 정면) + 스케일 다운(머리 크기에 맞춤) 필요.</w:t>
+      </w:r>
+    </w:p>
+    <w:p>
+      <w:pPr>
         <w:pStyle w:val="Heading2"/>
       </w:pPr>
       <w:r>
-        <w:t>8.4 입술 (lips) 노드</w:t>
+        <w:t>8.4 입술 파일</w:t>
       </w:r>
     </w:p>
     <w:p>
@@ -3411,7 +3540,7 @@
         <w:pStyle w:val="ListBullet"/>
       </w:pPr>
       <w:r>
-        <w:t>정점 약 162,000, 단일 메시</w:t>
+        <w:t>단일 메시, 약 162,000 정점</w:t>
       </w:r>
     </w:p>
     <w:p>
@@ -3419,7 +3548,7 @@
         <w:pStyle w:val="ListBullet"/>
       </w:pPr>
       <w:r>
-        <w:t>적용된 변환: 회전 +90°(Y축), 스케일 0.14, 위치 (0.38, -0.02, 0)</w:t>
+        <w:t>로컬 좌표: 정면 뷰가 XY 평면, 깊이가 Z. 크기 X ±0.95, Y ±0.59, Z ±0.67.</w:t>
       </w:r>
     </w:p>
     <w:p>
@@ -3456,10 +3585,18 @@
     </w:p>
     <w:p>
       <w:pPr>
+        <w:pStyle w:val="ListBullet"/>
+      </w:pPr>
+      <w:r>
+        <w:t>통합 시 적절한 회전·스케일 다운 후 머리의 입 위치에 배치.</w:t>
+      </w:r>
+    </w:p>
+    <w:p>
+      <w:pPr>
         <w:pStyle w:val="Heading2"/>
       </w:pPr>
       <w:r>
-        <w:t>8.5 머리 (head) 노드</w:t>
+        <w:t>8.5 머리 파일</w:t>
       </w:r>
     </w:p>
     <w:p>
@@ -3467,7 +3604,7 @@
         <w:pStyle w:val="ListBullet"/>
       </w:pPr>
       <w:r>
-        <w:t>기존 사지철 단면 모델 그대로 (Y축 ±0.95, X축 ±0.52, Z축 ±0.076의 얇은 슬랩)</w:t>
+        <w:t>기존 사지철 단면 모델 그대로 (얇은 슬랩 형태, Y축이 머리 높이)</w:t>
       </w:r>
     </w:p>
     <w:p>
@@ -3491,12 +3628,12 @@
         <w:pStyle w:val="Heading2"/>
       </w:pPr>
       <w:r>
-        <w:t>8.6 위치 미세조정 안내</w:t>
+        <w:t>8.6 통합 작업 안내</w:t>
       </w:r>
     </w:p>
     <w:p>
       <w:r>
-        <w:t>혀와 입술의 위치는 1차 정렬값이며 리토폴로지 시 자연스럽게 조정하셔도 됩니다. 핵심은 12개 블렌드셰이프가 사양서대로 작동하는 것입니다.</w:t>
+        <w:t>혀와 입술의 정확한 위치·크기는 리토폴로지 시 자연스럽게 잡아 주세요. 핵심은 12개 블렌드셰이프가 사양서대로 작동하는 것이며, 머리의 구강/입 영역에 혀·입술이 자연스럽게 자리하면 됩니다.</w:t>
       </w:r>
     </w:p>
     <w:p>
@@ -3533,7 +3670,7 @@
     </w:p>
     <w:p>
       <w:r>
-        <w:t>변경 이력 — v2.4 (2026-05): §8 통합 3D 데이터(head-combined.glb) 참고 섹션 신설 — 파일 구조(head/tongue/lips 노드), 좌표 규약, 부위별 변환 매개변수, 사전 정보 (혀의 median sulcus 사전 모델링, 입술 아티팩트 정리·별도 머티리얼 요청 등). 기존 §8(웹 연동)은 §9로 이동. v2.3: 자음 표를 조음 위치·방법별 그룹(11그룹)으로 통합 (평음/격음/경음은 시각적 구분 불가 → 동일 그룹). §5.5(VOT) 섹션 삭제. §5.4 받침 미파열 항목에 비음도 포함. v2.2: 모든 음소 음성학적 재검증. ㅇ(받침) 0.9→1.0, 파찰음 폐쇄+개방 명시, ㅎ 동시조음 명시, §5.4 allophones 섹션 신설. v2.1: 조음 원리(접촉/좁힘/개방) 명시, ㅅㅆ ㄹ설측 정정. v2: 풀 3D 모델, tongue_lateral_channel 추가, 한국어 음운 전체 매핑. v1: 사지철 단면 + 11개 타깃 초안.</w:t>
+        <w:t>변경 이력 — v2.4 (2026-05): §8 전달 3D 데이터(3개 분리 파일) 참고 섹션 신설 — 사지철 머리·풀 3D 혀·풀 3D 입술 각 .glb 파일의 좌표·정점·텍스처 상태 및 통합 안내 (혀의 median sulcus 사전 모델링, 입술 아티팩트 정리·별도 머티리얼 요청 등). 기존 §8(웹 연동)은 §9로 이동. v2.3: 자음 표를 조음 위치·방법별 그룹(11그룹)으로 통합 (평음/격음/경음은 시각적 구분 불가 → 동일 그룹). §5.5(VOT) 섹션 삭제. §5.4 받침 미파열 항목에 비음도 포함. v2.2: 모든 음소 음성학적 재검증. ㅇ(받침) 0.9→1.0, 파찰음 폐쇄+개방 명시, ㅎ 동시조음 명시, §5.4 allophones 섹션 신설. v2.1: 조음 원리(접촉/좁힘/개방) 명시, ㅅㅆ ㄹ설측 정정. v2: 풀 3D 모델, tongue_lateral_channel 추가, 한국어 음운 전체 매핑. v1: 사지철 단면 + 11개 타깃 초안.</w:t>
       </w:r>
     </w:p>
     <w:sectPr>

</xml_diff>